<commit_message>
[agent-foundations][decision-theory] Link real shareable URLs instead of module-package references
Agent Foundations doc: replaced 'module package' references with the
shareable Google Drive / Jotform links from the pre-reading doc (lecture
slides, Agency exercise sheet, the Optimization and thermodynamics note
now the pre-reading for that track, and the live daily-checkpoint form);
made the optimization note the primary track reading with the LessWrong
posts as underlying sources.

Decision Theory doc: same fix for parity (slides and reading list now
point to the visible iliad.au.pe Decision Theory session page; tournament
handout already linked), so no reference depends on invisible in-repo
artifacts.

Co-Authored-By: Claude Opus 4.8 <noreply@anthropic.com>
Claude-Session: https://claude.ai/code/session_01CXDoCaoFxocAwLUZMWSSzX
</commit_message>
<xml_diff>
--- a/agent foundations/Agent Foundations module.docx
+++ b/agent foundations/Agent Foundations module.docx
@@ -82,7 +82,7 @@
         <w:pStyle w:val="FirstParagraph"/>
       </w:pPr>
       <w:r>
-        <w:t xml:space="preserve">Daniel C wrote and taught the module. Satya Benson (Williams College) contributed to the content. The pre-reading topics, fundamental readings, exercises, and lecture slides referenced below are part of the module package.</w:t>
+        <w:t xml:space="preserve">Daniel C wrote and taught the module. Satya Benson (Williams College) contributed to the content. The pre-reading topics, fundamental readings, exercises, lecture slides, and daily-checkpoint form are linked in the Content section below.</w:t>
       </w:r>
     </w:p>
     <w:bookmarkEnd w:id="20"/>
@@ -370,7 +370,7 @@
       </w:r>
     </w:p>
     <w:bookmarkEnd w:id="22"/>
-    <w:bookmarkStart w:id="57" w:name="content"/>
+    <w:bookmarkStart w:id="61" w:name="content"/>
     <w:p>
       <w:pPr>
         <w:pStyle w:val="Heading1"/>
@@ -384,25 +384,41 @@
         <w:pStyle w:val="FirstParagraph"/>
       </w:pPr>
       <w:r>
-        <w:t xml:space="preserve">Slides: the Agent Foundations lecture deck (PDF and editable LaTeX in the module package). Exercise sheet and worked solutions:</w:t>
-      </w:r>
-      <w:r>
-        <w:t xml:space="preserve"> </w:t>
-      </w:r>
-      <w:r>
-        <w:rPr>
-          <w:rStyle w:val="VerbatimChar"/>
-        </w:rPr>
-        <w:t xml:space="preserve">Agency_exercise_V2.pdf</w:t>
-      </w:r>
-      <w:r>
-        <w:t xml:space="preserve"> </w:t>
-      </w:r>
-      <w:r>
-        <w:t xml:space="preserve">and the solutions set in the package.</w:t>
-      </w:r>
-    </w:p>
-    <w:bookmarkStart w:id="25" w:name="fast-track"/>
+        <w:t xml:space="preserve">Slides:</w:t>
+      </w:r>
+      <w:r>
+        <w:t xml:space="preserve"> </w:t>
+      </w:r>
+      <w:hyperlink r:id="rId23">
+        <w:r>
+          <w:rPr>
+            <w:rStyle w:val="Hyperlink"/>
+          </w:rPr>
+          <w:t xml:space="preserve">Agent Foundations lecture slides</w:t>
+        </w:r>
+      </w:hyperlink>
+      <w:r>
+        <w:t xml:space="preserve">. Exercise sheet:</w:t>
+      </w:r>
+      <w:r>
+        <w:t xml:space="preserve"> </w:t>
+      </w:r>
+      <w:hyperlink r:id="rId24">
+        <w:r>
+          <w:rPr>
+            <w:rStyle w:val="Hyperlink"/>
+          </w:rPr>
+          <w:t xml:space="preserve">Agency exercises</w:t>
+        </w:r>
+      </w:hyperlink>
+      <w:r>
+        <w:t xml:space="preserve"> </w:t>
+      </w:r>
+      <w:r>
+        <w:t xml:space="preserve">(worked solutions available to instructors).</w:t>
+      </w:r>
+    </w:p>
+    <w:bookmarkStart w:id="27" w:name="fast-track"/>
     <w:p>
       <w:pPr>
         <w:pStyle w:val="Heading2"/>
@@ -463,7 +479,7 @@
       <w:r>
         <w:t xml:space="preserve"> </w:t>
       </w:r>
-      <w:hyperlink r:id="rId23">
+      <w:hyperlink r:id="rId25">
         <w:r>
           <w:rPr>
             <w:rStyle w:val="Hyperlink"/>
@@ -480,7 +496,7 @@
       <w:r>
         <w:t xml:space="preserve"> </w:t>
       </w:r>
-      <w:hyperlink r:id="rId24">
+      <w:hyperlink r:id="rId26">
         <w:r>
           <w:rPr>
             <w:rStyle w:val="Hyperlink"/>
@@ -537,8 +553,8 @@
         <w:t xml:space="preserve">Skim the takeaways at the end of each strand summary.</w:t>
       </w:r>
     </w:p>
-    <w:bookmarkEnd w:id="25"/>
-    <w:bookmarkStart w:id="34" w:name="main-content"/>
+    <w:bookmarkEnd w:id="27"/>
+    <w:bookmarkStart w:id="38" w:name="main-content"/>
     <w:p>
       <w:pPr>
         <w:pStyle w:val="Heading2"/>
@@ -620,7 +636,7 @@
         <w:t xml:space="preserve">.</w:t>
       </w:r>
     </w:p>
-    <w:bookmarkStart w:id="26" w:name="morning-lecture"/>
+    <w:bookmarkStart w:id="28" w:name="morning-lecture"/>
     <w:p>
       <w:pPr>
         <w:pStyle w:val="Heading3"/>
@@ -895,8 +911,8 @@
         <w:t xml:space="preserve">: part of the world, made of the same pieces, smaller than its environment, with no crisp boundary, and able to be copied, modified, or to model itself. Embeddedness is what makes self-improvement, multi-agent reasoning about copies, and self-reference unavoidable, and it is what the rest of the day is about.</w:t>
       </w:r>
     </w:p>
-    <w:bookmarkEnd w:id="26"/>
-    <w:bookmarkStart w:id="27" w:name="the-six-strands-pre-reading-tracks"/>
+    <w:bookmarkEnd w:id="28"/>
+    <w:bookmarkStart w:id="30" w:name="the-six-strands-pre-reading-tracks"/>
     <w:p>
       <w:pPr>
         <w:pStyle w:val="Heading3"/>
@@ -1657,7 +1673,21 @@
         <w:t xml:space="preserve"> </w:t>
       </w:r>
       <w:r>
-        <w:t xml:space="preserve">A self-contained 31-page note developing this strand is included in the module package.</w:t>
+        <w:t xml:space="preserve">A self-contained note developing this strand,</w:t>
+      </w:r>
+      <w:r>
+        <w:t xml:space="preserve"> </w:t>
+      </w:r>
+      <w:hyperlink r:id="rId29">
+        <w:r>
+          <w:rPr>
+            <w:rStyle w:val="Hyperlink"/>
+          </w:rPr>
+          <w:t xml:space="preserve">Optimization and thermodynamics</w:t>
+        </w:r>
+      </w:hyperlink>
+      <w:r>
+        <w:t xml:space="preserve">, is the pre-reading for this track (read entirely; the appendix is optional).</w:t>
       </w:r>
     </w:p>
     <w:p>
@@ -1831,8 +1861,8 @@
         <w:t xml:space="preserve">”</w:t>
       </w:r>
     </w:p>
-    <w:bookmarkEnd w:id="27"/>
-    <w:bookmarkStart w:id="30" w:name="fundamental-reading"/>
+    <w:bookmarkEnd w:id="30"/>
+    <w:bookmarkStart w:id="33" w:name="fundamental-reading"/>
     <w:p>
       <w:pPr>
         <w:pStyle w:val="Heading3"/>
@@ -1861,7 +1891,7 @@
         </w:numPr>
         <w:pStyle w:val="Compact"/>
       </w:pPr>
-      <w:hyperlink r:id="rId23">
+      <w:hyperlink r:id="rId25">
         <w:r>
           <w:rPr>
             <w:rStyle w:val="Hyperlink"/>
@@ -1881,7 +1911,7 @@
         </w:numPr>
         <w:pStyle w:val="Compact"/>
       </w:pPr>
-      <w:hyperlink r:id="rId24">
+      <w:hyperlink r:id="rId26">
         <w:r>
           <w:rPr>
             <w:rStyle w:val="Hyperlink"/>
@@ -1901,7 +1931,7 @@
         </w:numPr>
         <w:pStyle w:val="Compact"/>
       </w:pPr>
-      <w:hyperlink r:id="rId28">
+      <w:hyperlink r:id="rId31">
         <w:r>
           <w:rPr>
             <w:rStyle w:val="Hyperlink"/>
@@ -1933,7 +1963,7 @@
         </w:numPr>
         <w:pStyle w:val="Compact"/>
       </w:pPr>
-      <w:hyperlink r:id="rId29">
+      <w:hyperlink r:id="rId32">
         <w:r>
           <w:rPr>
             <w:rStyle w:val="Hyperlink"/>
@@ -1945,8 +1975,8 @@
         <w:t xml:space="preserve">: read entirely. Why a capable mind plausibly contains a retargetable search process.</w:t>
       </w:r>
     </w:p>
-    <w:bookmarkEnd w:id="30"/>
-    <w:bookmarkStart w:id="31" w:name="cross-pollination-discussion"/>
+    <w:bookmarkEnd w:id="33"/>
+    <w:bookmarkStart w:id="34" w:name="cross-pollination-discussion"/>
     <w:p>
       <w:pPr>
         <w:pStyle w:val="Heading3"/>
@@ -2164,8 +2194,8 @@
         <w:t xml:space="preserve">analogue. How does logical uncertainty reshape coherence arguments?</w:t>
       </w:r>
     </w:p>
-    <w:bookmarkEnd w:id="31"/>
-    <w:bookmarkStart w:id="32" w:name="exercise-session"/>
+    <w:bookmarkEnd w:id="34"/>
+    <w:bookmarkStart w:id="35" w:name="exercise-session"/>
     <w:p>
       <w:pPr>
         <w:pStyle w:val="Heading3"/>
@@ -2191,7 +2221,21 @@
         <w:pStyle w:val="BodyText"/>
       </w:pPr>
       <w:r>
-        <w:t xml:space="preserve">Five exercises (full statements and worked solutions in the exercise sheet and solutions set in the package), grouped by topic:</w:t>
+        <w:t xml:space="preserve">Five exercises (full statements in the</w:t>
+      </w:r>
+      <w:r>
+        <w:t xml:space="preserve"> </w:t>
+      </w:r>
+      <w:hyperlink r:id="rId24">
+        <w:r>
+          <w:rPr>
+            <w:rStyle w:val="Hyperlink"/>
+          </w:rPr>
+          <w:t xml:space="preserve">exercise sheet</w:t>
+        </w:r>
+      </w:hyperlink>
+      <w:r>
+        <w:t xml:space="preserve">; worked solutions available to instructors), grouped by topic:</w:t>
       </w:r>
     </w:p>
     <w:p>
@@ -2340,8 +2384,8 @@
         <w:t xml:space="preserve">(difficulty 3/5, importance 3/5). Optimal input distributions over independent channels: mutual information decomposes across channels, independence improves throughput, and an optimal policy need not coordinate across a modular environment (connecting modularity to tractable optimization).</w:t>
       </w:r>
     </w:p>
-    <w:bookmarkEnd w:id="32"/>
-    <w:bookmarkStart w:id="33" w:name="daily-checkpoint"/>
+    <w:bookmarkEnd w:id="35"/>
+    <w:bookmarkStart w:id="37" w:name="daily-checkpoint"/>
     <w:p>
       <w:pPr>
         <w:pStyle w:val="Heading3"/>
@@ -2367,7 +2411,21 @@
         <w:pStyle w:val="BodyText"/>
       </w:pPr>
       <w:r>
-        <w:t xml:space="preserve">Answers at the end of this section.</w:t>
+        <w:t xml:space="preserve">The live form used on the day:</w:t>
+      </w:r>
+      <w:r>
+        <w:t xml:space="preserve"> </w:t>
+      </w:r>
+      <w:hyperlink r:id="rId36">
+        <w:r>
+          <w:rPr>
+            <w:rStyle w:val="Hyperlink"/>
+          </w:rPr>
+          <w:t xml:space="preserve">https://form.jotform.com/261724721333048</w:t>
+        </w:r>
+      </w:hyperlink>
+      <w:r>
+        <w:t xml:space="preserve">. The questions below are a self-contained version; answers at the end of this section.</w:t>
       </w:r>
     </w:p>
     <w:p>
@@ -2529,9 +2587,9 @@
         <w:t xml:space="preserve">Answers: 1(b), 2(b), 3(b), 4(b), 5(b), 6(b).</w:t>
       </w:r>
     </w:p>
-    <w:bookmarkEnd w:id="33"/>
-    <w:bookmarkEnd w:id="34"/>
-    <w:bookmarkStart w:id="56" w:name="learn-more"/>
+    <w:bookmarkEnd w:id="37"/>
+    <w:bookmarkEnd w:id="38"/>
+    <w:bookmarkStart w:id="60" w:name="learn-more"/>
     <w:p>
       <w:pPr>
         <w:pStyle w:val="Heading2"/>
@@ -2568,7 +2626,7 @@
       <w:r>
         <w:t xml:space="preserve"> </w:t>
       </w:r>
-      <w:hyperlink r:id="rId35">
+      <w:hyperlink r:id="rId39">
         <w:r>
           <w:rPr>
             <w:rStyle w:val="Hyperlink"/>
@@ -2639,7 +2697,7 @@
       <w:r>
         <w:t xml:space="preserve"> </w:t>
       </w:r>
-      <w:hyperlink r:id="rId36">
+      <w:hyperlink r:id="rId40">
         <w:r>
           <w:rPr>
             <w:rStyle w:val="Hyperlink"/>
@@ -2659,7 +2717,7 @@
       <w:r>
         <w:t xml:space="preserve"> </w:t>
       </w:r>
-      <w:hyperlink r:id="rId37">
+      <w:hyperlink r:id="rId41">
         <w:r>
           <w:rPr>
             <w:rStyle w:val="Hyperlink"/>
@@ -2691,7 +2749,7 @@
       <w:r>
         <w:t xml:space="preserve"> </w:t>
       </w:r>
-      <w:hyperlink r:id="rId38">
+      <w:hyperlink r:id="rId42">
         <w:r>
           <w:rPr>
             <w:rStyle w:val="Hyperlink"/>
@@ -2714,7 +2772,7 @@
       <w:r>
         <w:t xml:space="preserve"> </w:t>
       </w:r>
-      <w:hyperlink r:id="rId39">
+      <w:hyperlink r:id="rId43">
         <w:r>
           <w:rPr>
             <w:rStyle w:val="Hyperlink"/>
@@ -2734,7 +2792,7 @@
       <w:r>
         <w:t xml:space="preserve"> </w:t>
       </w:r>
-      <w:hyperlink r:id="rId40">
+      <w:hyperlink r:id="rId44">
         <w:r>
           <w:rPr>
             <w:rStyle w:val="Hyperlink"/>
@@ -2799,7 +2857,7 @@
       <w:r>
         <w:t xml:space="preserve"> </w:t>
       </w:r>
-      <w:hyperlink r:id="rId41">
+      <w:hyperlink r:id="rId45">
         <w:r>
           <w:rPr>
             <w:rStyle w:val="Hyperlink"/>
@@ -2819,7 +2877,7 @@
       <w:r>
         <w:t xml:space="preserve"> </w:t>
       </w:r>
-      <w:hyperlink r:id="rId42">
+      <w:hyperlink r:id="rId46">
         <w:r>
           <w:rPr>
             <w:rStyle w:val="Hyperlink"/>
@@ -2854,7 +2912,7 @@
       <w:r>
         <w:t xml:space="preserve"> </w:t>
       </w:r>
-      <w:hyperlink r:id="rId43">
+      <w:hyperlink r:id="rId47">
         <w:r>
           <w:rPr>
             <w:rStyle w:val="Hyperlink"/>
@@ -2881,12 +2939,35 @@
         <w:t xml:space="preserve"> </w:t>
       </w:r>
       <w:r>
+        <w:t xml:space="preserve">- Primary reading for the track:</w:t>
+      </w:r>
+      <w:r>
+        <w:t xml:space="preserve"> </w:t>
+      </w:r>
+      <w:hyperlink r:id="rId29">
+        <w:r>
+          <w:rPr>
+            <w:rStyle w:val="Hyperlink"/>
+          </w:rPr>
+          <w:t xml:space="preserve">Optimization and thermodynamics</w:t>
+        </w:r>
+      </w:hyperlink>
+      <w:r>
+        <w:t xml:space="preserve"> </w:t>
+      </w:r>
+      <w:r>
+        <w:t xml:space="preserve">(read entirely; appendix optional), a self-contained development of the strand. Its underlying sources, for going deeper:</w:t>
+      </w:r>
+      <w:r>
+        <w:t xml:space="preserve"> </w:t>
+      </w:r>
+      <w:r>
         <w:t xml:space="preserve">-</w:t>
       </w:r>
       <w:r>
         <w:t xml:space="preserve"> </w:t>
       </w:r>
-      <w:hyperlink r:id="rId44">
+      <w:hyperlink r:id="rId48">
         <w:r>
           <w:rPr>
             <w:rStyle w:val="Hyperlink"/>
@@ -2924,7 +3005,7 @@
       <w:r>
         <w:t xml:space="preserve"> </w:t>
       </w:r>
-      <w:hyperlink r:id="rId45">
+      <w:hyperlink r:id="rId49">
         <w:r>
           <w:rPr>
             <w:rStyle w:val="Hyperlink"/>
@@ -2944,7 +3025,7 @@
       <w:r>
         <w:t xml:space="preserve"> </w:t>
       </w:r>
-      <w:hyperlink r:id="rId46">
+      <w:hyperlink r:id="rId50">
         <w:r>
           <w:rPr>
             <w:rStyle w:val="Hyperlink"/>
@@ -2964,7 +3045,7 @@
       <w:r>
         <w:t xml:space="preserve"> </w:t>
       </w:r>
-      <w:hyperlink r:id="rId47">
+      <w:hyperlink r:id="rId51">
         <w:r>
           <w:rPr>
             <w:rStyle w:val="Hyperlink"/>
@@ -2978,7 +3059,7 @@
       <w:r>
         <w:t xml:space="preserve"> </w:t>
       </w:r>
-      <w:hyperlink r:id="rId48">
+      <w:hyperlink r:id="rId52">
         <w:r>
           <w:rPr>
             <w:rStyle w:val="Hyperlink"/>
@@ -3010,7 +3091,7 @@
       <w:r>
         <w:t xml:space="preserve"> </w:t>
       </w:r>
-      <w:hyperlink r:id="rId49">
+      <w:hyperlink r:id="rId53">
         <w:r>
           <w:rPr>
             <w:rStyle w:val="Hyperlink"/>
@@ -3030,7 +3111,7 @@
       <w:r>
         <w:t xml:space="preserve"> </w:t>
       </w:r>
-      <w:hyperlink r:id="rId50">
+      <w:hyperlink r:id="rId54">
         <w:r>
           <w:rPr>
             <w:rStyle w:val="Hyperlink"/>
@@ -3050,7 +3131,7 @@
       <w:r>
         <w:t xml:space="preserve"> </w:t>
       </w:r>
-      <w:hyperlink r:id="rId51">
+      <w:hyperlink r:id="rId55">
         <w:r>
           <w:rPr>
             <w:rStyle w:val="Hyperlink"/>
@@ -3076,7 +3157,7 @@
       <w:r>
         <w:t xml:space="preserve"> </w:t>
       </w:r>
-      <w:hyperlink r:id="rId52">
+      <w:hyperlink r:id="rId56">
         <w:r>
           <w:rPr>
             <w:rStyle w:val="Hyperlink"/>
@@ -3093,7 +3174,7 @@
       <w:r>
         <w:t xml:space="preserve"> </w:t>
       </w:r>
-      <w:hyperlink r:id="rId53">
+      <w:hyperlink r:id="rId57">
         <w:r>
           <w:rPr>
             <w:rStyle w:val="Hyperlink"/>
@@ -3107,7 +3188,7 @@
       <w:r>
         <w:t xml:space="preserve"> </w:t>
       </w:r>
-      <w:hyperlink r:id="rId54">
+      <w:hyperlink r:id="rId58">
         <w:r>
           <w:rPr>
             <w:rStyle w:val="Hyperlink"/>
@@ -3121,7 +3202,7 @@
       <w:r>
         <w:t xml:space="preserve"> </w:t>
       </w:r>
-      <w:hyperlink r:id="rId55">
+      <w:hyperlink r:id="rId59">
         <w:r>
           <w:rPr>
             <w:rStyle w:val="Hyperlink"/>
@@ -3149,9 +3230,9 @@
         <w:t xml:space="preserve">(whether strong optimization provably entails an internal world model), embedded variants of AIXI, and resource-theoretic accounts of instrumental convergence.</w:t>
       </w:r>
     </w:p>
-    <w:bookmarkEnd w:id="56"/>
-    <w:bookmarkEnd w:id="57"/>
-    <w:bookmarkStart w:id="65" w:name="teaching-guide"/>
+    <w:bookmarkEnd w:id="60"/>
+    <w:bookmarkEnd w:id="61"/>
+    <w:bookmarkStart w:id="69" w:name="teaching-guide"/>
     <w:p>
       <w:pPr>
         <w:pStyle w:val="Heading1"/>
@@ -3168,7 +3249,7 @@
         <w:t xml:space="preserve">The day mixes a single framing lecture with self-directed reading, structured discussion, and exercises. Students should already have read their one chosen pre-reading track.</w:t>
       </w:r>
     </w:p>
-    <w:bookmarkStart w:id="58" w:name="time-schedule"/>
+    <w:bookmarkStart w:id="62" w:name="time-schedule"/>
     <w:p>
       <w:pPr>
         <w:pStyle w:val="Heading2"/>
@@ -3269,8 +3350,8 @@
         <w:t xml:space="preserve">(Reading plus discussion totals 3.5 hours; lecture 1 hour; exercises 2 hours. Adjust the reading/discussion split toward discussion if the room is engaged.)</w:t>
       </w:r>
     </w:p>
-    <w:bookmarkEnd w:id="58"/>
-    <w:bookmarkStart w:id="59" w:name="required-materials"/>
+    <w:bookmarkEnd w:id="62"/>
+    <w:bookmarkStart w:id="63" w:name="required-materials"/>
     <w:p>
       <w:pPr>
         <w:pStyle w:val="Heading2"/>
@@ -3351,8 +3432,8 @@
         <w:t xml:space="preserve">The four prerequisite refresher notes, shared with students a few days ahead.</w:t>
       </w:r>
     </w:p>
-    <w:bookmarkEnd w:id="59"/>
-    <w:bookmarkStart w:id="60" w:name="morning-lecture-1"/>
+    <w:bookmarkEnd w:id="63"/>
+    <w:bookmarkStart w:id="64" w:name="morning-lecture-1"/>
     <w:p>
       <w:pPr>
         <w:pStyle w:val="Heading2"/>
@@ -3419,8 +3500,8 @@
         <w:t xml:space="preserve">the previews only need to plant the question each strand answers; depth comes from the students’ own pre-reading and the discussion, so do not over-explain any one strand here. Leave 10 minutes for questions.</w:t>
       </w:r>
     </w:p>
-    <w:bookmarkEnd w:id="60"/>
-    <w:bookmarkStart w:id="61" w:name="fundamental-reading-1"/>
+    <w:bookmarkEnd w:id="64"/>
+    <w:bookmarkStart w:id="65" w:name="fundamental-reading-1"/>
     <w:p>
       <w:pPr>
         <w:pStyle w:val="Heading2"/>
@@ -3466,8 +3547,8 @@
         <w:t xml:space="preserve">, not for full coverage; the connections are the raw material for the discussion. Embedded agency is the anchor; the other three each sharpen one thread (why this approach, reflective stability, general-purpose search).</w:t>
       </w:r>
     </w:p>
-    <w:bookmarkEnd w:id="61"/>
-    <w:bookmarkStart w:id="62" w:name="cross-pollination-discussion-1"/>
+    <w:bookmarkEnd w:id="65"/>
+    <w:bookmarkStart w:id="66" w:name="cross-pollination-discussion-1"/>
     <w:p>
       <w:pPr>
         <w:pStyle w:val="Heading2"/>
@@ -3515,8 +3596,8 @@
         <w:t xml:space="preserve">). Close with each group sharing one connection they found.</w:t>
       </w:r>
     </w:p>
-    <w:bookmarkEnd w:id="62"/>
-    <w:bookmarkStart w:id="63" w:name="exercise-session-1"/>
+    <w:bookmarkEnd w:id="66"/>
+    <w:bookmarkStart w:id="67" w:name="exercise-session-1"/>
     <w:p>
       <w:pPr>
         <w:pStyle w:val="Heading2"/>
@@ -3565,8 +3646,8 @@
         <w:t xml:space="preserve">the FairBot part is the payoff (Löbian cooperation), and it directly seeds the Decision Theory day’s tournament; flag the connection.</w:t>
       </w:r>
     </w:p>
-    <w:bookmarkEnd w:id="63"/>
-    <w:bookmarkStart w:id="64" w:name="daily-checkpoint-1"/>
+    <w:bookmarkEnd w:id="67"/>
+    <w:bookmarkStart w:id="68" w:name="daily-checkpoint-1"/>
     <w:p>
       <w:pPr>
         <w:pStyle w:val="Heading2"/>
@@ -3583,9 +3664,9 @@
         <w:t xml:space="preserve">Run the six-question checkpoint (above) as a quick individual quiz, then read out the answers. It doubles as an attendance check and tees up the feedback form.</w:t>
       </w:r>
     </w:p>
-    <w:bookmarkEnd w:id="64"/>
-    <w:bookmarkEnd w:id="65"/>
-    <w:bookmarkStart w:id="66" w:name="notes-for-future-iterations"/>
+    <w:bookmarkEnd w:id="68"/>
+    <w:bookmarkEnd w:id="69"/>
+    <w:bookmarkStart w:id="70" w:name="notes-for-future-iterations"/>
     <w:p>
       <w:pPr>
         <w:pStyle w:val="Heading1"/>
@@ -3670,7 +3751,7 @@
         <w:t xml:space="preserve">After teaching: record which prerequisite refreshers students actually needed, and tighten the pre-reading track sizes so every group in the discussion has at least one student per represented track.</w:t>
       </w:r>
     </w:p>
-    <w:bookmarkEnd w:id="66"/>
+    <w:bookmarkEnd w:id="70"/>
     <w:sectPr/>
   </w:body>
 </w:document>

</xml_diff>

<commit_message>
[agent-foundations][decision-theory] Fundamental reading before strands (AF); keep DT prompt in Main content
- Agent Foundations: move the Fundamental reading sub-module before the
  five strands in Main content, and update the top-to-bottom reading guide
  to reflect the new order (spine -> fundamental readings -> strands ->
  discussion -> exercises -> checkpoint). Teaching-guide and time-schedule
  order already had fundamental reading first.
- Decision Theory: revert the discussion prompt back into the Main content
  Reading-and-discussion section; the teaching guide now references it
  rather than restating it.

Co-Authored-By: Claude Opus 4.8 <noreply@anthropic.com>
Claude-Session: https://claude.ai/code/session_01CXDoCaoFxocAwLUZMWSSzX
</commit_message>
<xml_diff>
--- a/agent foundations/Agent Foundations module.docx
+++ b/agent foundations/Agent Foundations module.docx
@@ -592,7 +592,7 @@
         <w:pStyle w:val="BodyText"/>
       </w:pPr>
       <w:r>
-        <w:t xml:space="preserve">Read top to bottom, this section runs: the unifying spine (the morning lecture), then the five strands each with its readings, then the fundamental readings, the cross-pollination discussion, the exercises, and a self-check.</w:t>
+        <w:t xml:space="preserve">Read top to bottom, this section runs: the unifying spine (the morning lecture), then the fundamental readings that give a bird’s-eye view, then the five strands each with its readings, then the cross-pollination discussion, the exercises, and a self-check.</w:t>
       </w:r>
     </w:p>
     <w:bookmarkStart w:id="28" w:name="morning-lecture"/>
@@ -871,7 +871,109 @@
       </w:r>
     </w:p>
     <w:bookmarkEnd w:id="28"/>
-    <w:bookmarkStart w:id="44" w:name="the-five-strands-pre-reading-tracks"/>
+    <w:bookmarkStart w:id="31" w:name="fundamental-reading"/>
+    <w:p>
+      <w:pPr>
+        <w:pStyle w:val="Heading3"/>
+      </w:pPr>
+      <w:r>
+        <w:t xml:space="preserve">Fundamental reading</w:t>
+      </w:r>
+    </w:p>
+    <w:p>
+      <w:pPr>
+        <w:pStyle w:val="FirstParagraph"/>
+      </w:pPr>
+      <w:r>
+        <w:rPr>
+          <w:iCs/>
+          <w:i/>
+        </w:rPr>
+        <w:t xml:space="preserve">Intent: a shared bird’s-eye view that ties the five tracks to embedded agency, so the mixed-group discussion has common ground. Everyone reads these on the day (skimming beforehand is fine).</w:t>
+      </w:r>
+    </w:p>
+    <w:p>
+      <w:pPr>
+        <w:numPr>
+          <w:ilvl w:val="0"/>
+          <w:numId w:val="1004"/>
+        </w:numPr>
+        <w:pStyle w:val="Compact"/>
+      </w:pPr>
+      <w:hyperlink r:id="rId25">
+        <w:r>
+          <w:rPr>
+            <w:rStyle w:val="Hyperlink"/>
+          </w:rPr>
+          <w:t xml:space="preserve">Embedded agency</w:t>
+        </w:r>
+      </w:hyperlink>
+      <w:r>
+        <w:t xml:space="preserve">: read up to and including section 3.3, then section 4.1. The canonical statement of the embedded-agency problem cluster (the Alexei/Emmy framing the lecture uses).</w:t>
+      </w:r>
+    </w:p>
+    <w:p>
+      <w:pPr>
+        <w:numPr>
+          <w:ilvl w:val="0"/>
+          <w:numId w:val="1004"/>
+        </w:numPr>
+        <w:pStyle w:val="Compact"/>
+      </w:pPr>
+      <w:hyperlink r:id="rId26">
+        <w:r>
+          <w:rPr>
+            <w:rStyle w:val="Hyperlink"/>
+          </w:rPr>
+          <w:t xml:space="preserve">Why agent foundations</w:t>
+        </w:r>
+      </w:hyperlink>
+      <w:r>
+        <w:t xml:space="preserve">: read entirely. Why this abstract, theory-first approach is worth pursuing.</w:t>
+      </w:r>
+    </w:p>
+    <w:p>
+      <w:pPr>
+        <w:numPr>
+          <w:ilvl w:val="0"/>
+          <w:numId w:val="1004"/>
+        </w:numPr>
+        <w:pStyle w:val="Compact"/>
+      </w:pPr>
+      <w:hyperlink r:id="rId29">
+        <w:r>
+          <w:rPr>
+            <w:rStyle w:val="Hyperlink"/>
+          </w:rPr>
+          <w:t xml:space="preserve">Reflectively consistent degree of freedom</w:t>
+        </w:r>
+      </w:hyperlink>
+      <w:r>
+        <w:t xml:space="preserve">: read entirely. The precise notion behind a property an agent would not self-modify away, which is the day’s recurring theme of reflective stability.</w:t>
+      </w:r>
+    </w:p>
+    <w:p>
+      <w:pPr>
+        <w:numPr>
+          <w:ilvl w:val="0"/>
+          <w:numId w:val="1004"/>
+        </w:numPr>
+        <w:pStyle w:val="Compact"/>
+      </w:pPr>
+      <w:hyperlink r:id="rId30">
+        <w:r>
+          <w:rPr>
+            <w:rStyle w:val="Hyperlink"/>
+          </w:rPr>
+          <w:t xml:space="preserve">General purpose search</w:t>
+        </w:r>
+      </w:hyperlink>
+      <w:r>
+        <w:t xml:space="preserve">: read entirely. Why a capable mind plausibly contains a retargetable search process.</w:t>
+      </w:r>
+    </w:p>
+    <w:bookmarkEnd w:id="31"/>
+    <w:bookmarkStart w:id="47" w:name="the-five-strands-pre-reading-tracks"/>
     <w:p>
       <w:pPr>
         <w:pStyle w:val="Heading3"/>
@@ -993,7 +1095,7 @@
       <w:r>
         <w:t xml:space="preserve"> </w:t>
       </w:r>
-      <w:hyperlink r:id="rId29">
+      <w:hyperlink r:id="rId32">
         <w:r>
           <w:rPr>
             <w:rStyle w:val="Hyperlink"/>
@@ -1058,7 +1160,7 @@
       <w:r>
         <w:t xml:space="preserve"> </w:t>
       </w:r>
-      <w:hyperlink r:id="rId30">
+      <w:hyperlink r:id="rId33">
         <w:r>
           <w:rPr>
             <w:rStyle w:val="Hyperlink"/>
@@ -1072,7 +1174,7 @@
       <w:r>
         <w:t xml:space="preserve"> </w:t>
       </w:r>
-      <w:hyperlink r:id="rId31">
+      <w:hyperlink r:id="rId34">
         <w:r>
           <w:rPr>
             <w:rStyle w:val="Hyperlink"/>
@@ -1305,7 +1407,7 @@
       <w:r>
         <w:t xml:space="preserve"> </w:t>
       </w:r>
-      <w:hyperlink r:id="rId32">
+      <w:hyperlink r:id="rId35">
         <w:r>
           <w:rPr>
             <w:rStyle w:val="Hyperlink"/>
@@ -1322,7 +1424,7 @@
       <w:r>
         <w:t xml:space="preserve"> </w:t>
       </w:r>
-      <w:hyperlink r:id="rId33">
+      <w:hyperlink r:id="rId36">
         <w:r>
           <w:rPr>
             <w:rStyle w:val="Hyperlink"/>
@@ -1336,7 +1438,7 @@
       <w:r>
         <w:t xml:space="preserve"> </w:t>
       </w:r>
-      <w:hyperlink r:id="rId34">
+      <w:hyperlink r:id="rId37">
         <w:r>
           <w:rPr>
             <w:rStyle w:val="Hyperlink"/>
@@ -1500,7 +1602,7 @@
       <w:r>
         <w:t xml:space="preserve"> </w:t>
       </w:r>
-      <w:hyperlink r:id="rId35">
+      <w:hyperlink r:id="rId38">
         <w:r>
           <w:rPr>
             <w:rStyle w:val="Hyperlink"/>
@@ -1514,7 +1616,7 @@
       <w:r>
         <w:t xml:space="preserve"> </w:t>
       </w:r>
-      <w:hyperlink r:id="rId36">
+      <w:hyperlink r:id="rId39">
         <w:r>
           <w:rPr>
             <w:rStyle w:val="Hyperlink"/>
@@ -1765,7 +1867,7 @@
       <w:r>
         <w:t xml:space="preserve"> </w:t>
       </w:r>
-      <w:hyperlink r:id="rId37">
+      <w:hyperlink r:id="rId40">
         <w:r>
           <w:rPr>
             <w:rStyle w:val="Hyperlink"/>
@@ -1782,7 +1884,7 @@
       <w:r>
         <w:t xml:space="preserve"> </w:t>
       </w:r>
-      <w:hyperlink r:id="rId38">
+      <w:hyperlink r:id="rId41">
         <w:r>
           <w:rPr>
             <w:rStyle w:val="Hyperlink"/>
@@ -1814,7 +1916,7 @@
       <w:r>
         <w:t xml:space="preserve"> </w:t>
       </w:r>
-      <w:hyperlink r:id="rId39">
+      <w:hyperlink r:id="rId42">
         <w:r>
           <w:rPr>
             <w:rStyle w:val="Hyperlink"/>
@@ -1828,7 +1930,7 @@
       <w:r>
         <w:t xml:space="preserve"> </w:t>
       </w:r>
-      <w:hyperlink r:id="rId40">
+      <w:hyperlink r:id="rId43">
         <w:r>
           <w:rPr>
             <w:rStyle w:val="Hyperlink"/>
@@ -2023,7 +2125,7 @@
       <w:r>
         <w:t xml:space="preserve"> </w:t>
       </w:r>
-      <w:hyperlink r:id="rId41">
+      <w:hyperlink r:id="rId44">
         <w:r>
           <w:rPr>
             <w:rStyle w:val="Hyperlink"/>
@@ -2037,7 +2139,7 @@
       <w:r>
         <w:t xml:space="preserve"> </w:t>
       </w:r>
-      <w:hyperlink r:id="rId42">
+      <w:hyperlink r:id="rId45">
         <w:r>
           <w:rPr>
             <w:rStyle w:val="Hyperlink"/>
@@ -2051,7 +2153,7 @@
       <w:r>
         <w:t xml:space="preserve"> </w:t>
       </w:r>
-      <w:hyperlink r:id="rId43">
+      <w:hyperlink r:id="rId46">
         <w:r>
           <w:rPr>
             <w:rStyle w:val="Hyperlink"/>
@@ -2061,108 +2163,6 @@
       </w:hyperlink>
       <w:r>
         <w:t xml:space="preserve">.</w:t>
-      </w:r>
-    </w:p>
-    <w:bookmarkEnd w:id="44"/>
-    <w:bookmarkStart w:id="47" w:name="fundamental-reading"/>
-    <w:p>
-      <w:pPr>
-        <w:pStyle w:val="Heading3"/>
-      </w:pPr>
-      <w:r>
-        <w:t xml:space="preserve">Fundamental reading</w:t>
-      </w:r>
-    </w:p>
-    <w:p>
-      <w:pPr>
-        <w:pStyle w:val="FirstParagraph"/>
-      </w:pPr>
-      <w:r>
-        <w:rPr>
-          <w:iCs/>
-          <w:i/>
-        </w:rPr>
-        <w:t xml:space="preserve">Intent: a shared bird’s-eye view that ties the five tracks to embedded agency, so the mixed-group discussion has common ground. Everyone reads these on the day (skimming beforehand is fine).</w:t>
-      </w:r>
-    </w:p>
-    <w:p>
-      <w:pPr>
-        <w:numPr>
-          <w:ilvl w:val="0"/>
-          <w:numId w:val="1004"/>
-        </w:numPr>
-        <w:pStyle w:val="Compact"/>
-      </w:pPr>
-      <w:hyperlink r:id="rId25">
-        <w:r>
-          <w:rPr>
-            <w:rStyle w:val="Hyperlink"/>
-          </w:rPr>
-          <w:t xml:space="preserve">Embedded agency</w:t>
-        </w:r>
-      </w:hyperlink>
-      <w:r>
-        <w:t xml:space="preserve">: read up to and including section 3.3, then section 4.1. The canonical statement of the embedded-agency problem cluster (the Alexei/Emmy framing the lecture uses).</w:t>
-      </w:r>
-    </w:p>
-    <w:p>
-      <w:pPr>
-        <w:numPr>
-          <w:ilvl w:val="0"/>
-          <w:numId w:val="1004"/>
-        </w:numPr>
-        <w:pStyle w:val="Compact"/>
-      </w:pPr>
-      <w:hyperlink r:id="rId26">
-        <w:r>
-          <w:rPr>
-            <w:rStyle w:val="Hyperlink"/>
-          </w:rPr>
-          <w:t xml:space="preserve">Why agent foundations</w:t>
-        </w:r>
-      </w:hyperlink>
-      <w:r>
-        <w:t xml:space="preserve">: read entirely. Why this abstract, theory-first approach is worth pursuing.</w:t>
-      </w:r>
-    </w:p>
-    <w:p>
-      <w:pPr>
-        <w:numPr>
-          <w:ilvl w:val="0"/>
-          <w:numId w:val="1004"/>
-        </w:numPr>
-        <w:pStyle w:val="Compact"/>
-      </w:pPr>
-      <w:hyperlink r:id="rId45">
-        <w:r>
-          <w:rPr>
-            <w:rStyle w:val="Hyperlink"/>
-          </w:rPr>
-          <w:t xml:space="preserve">Reflectively consistent degree of freedom</w:t>
-        </w:r>
-      </w:hyperlink>
-      <w:r>
-        <w:t xml:space="preserve">: read entirely. The precise notion behind a property an agent would not self-modify away, which is the day’s recurring theme of reflective stability.</w:t>
-      </w:r>
-    </w:p>
-    <w:p>
-      <w:pPr>
-        <w:numPr>
-          <w:ilvl w:val="0"/>
-          <w:numId w:val="1004"/>
-        </w:numPr>
-        <w:pStyle w:val="Compact"/>
-      </w:pPr>
-      <w:hyperlink r:id="rId46">
-        <w:r>
-          <w:rPr>
-            <w:rStyle w:val="Hyperlink"/>
-          </w:rPr>
-          <w:t xml:space="preserve">General purpose search</w:t>
-        </w:r>
-      </w:hyperlink>
-      <w:r>
-        <w:t xml:space="preserve">: read entirely. Why a capable mind plausibly contains a retargetable search process.</w:t>
       </w:r>
     </w:p>
     <w:bookmarkEnd w:id="47"/>

</xml_diff>

<commit_message>
[agent-foundations][decision-theory] Harshest-critic audit pass on module docs
Five parallel audit lenses (template compliance x2, resource links,
internal consistency, factual calibration) plus a final sign-off
re-audit. ~58 fixes across both docs, including:
- redesigned daily checkpoints (varied answer keys, live Jotform links,
  answer keys moved to teaching guide)
- corrected tournament facts (no noise in League B, epsilon-grounded
  bot not a reference bot, unified announcement timing)
- fixed GrimTrigger debrief claim (only Random can trigger it)
- DT day now ends with checkpoint and feedback form per template
- exercise group headers matched to strands (Ex 4 optimization, Ex 5
  descriptive)
- editable LaTeX source links, Engage sections, sign-up links,
  pre-reading staleness note
- em-dashes converted to house-style parentheticals

Co-Authored-By: Claude Fable 5 <noreply@anthropic.com>
Claude-Session: https://claude.ai/code/session_01CXDoCaoFxocAwLUZMWSSzX
</commit_message>
<xml_diff>
--- a/agent foundations/Agent Foundations module.docx
+++ b/agent foundations/Agent Foundations module.docx
@@ -82,7 +82,7 @@
         <w:pStyle w:val="FirstParagraph"/>
       </w:pPr>
       <w:r>
-        <w:t xml:space="preserve">Daniel C wrote and taught the module. Satya Benson (Williams College) contributed to the content. The pre-reading topics, fundamental readings, exercises, lecture slides, and daily-checkpoint form are linked in the Content section below.</w:t>
+        <w:t xml:space="preserve">Daniel C (Iliad) wrote and taught the module. Satya Benson (Williams College) wrote parts of the content.</w:t>
       </w:r>
     </w:p>
     <w:bookmarkEnd w:id="20"/>
@@ -223,7 +223,7 @@
       </w:r>
     </w:p>
     <w:bookmarkEnd w:id="21"/>
-    <w:bookmarkStart w:id="22" w:name="prerequisites"/>
+    <w:bookmarkStart w:id="23" w:name="prerequisites"/>
     <w:p>
       <w:pPr>
         <w:pStyle w:val="Heading1"/>
@@ -289,7 +289,33 @@
         <w:pStyle w:val="Compact"/>
       </w:pPr>
       <w:r>
-        <w:t xml:space="preserve">Provided refresher notes cover the gaps: a</w:t>
+        <w:t xml:space="preserve">Background assumptions the day builds on (state them explicitly at the start; students from general math/physics backgrounds will not share them by default): that rigorous definitions of intelligence, agency, and alignment may be attainable at all; that superintelligent agents are a live possibility; that intelligence is about steering the world; that in the limit capable agents act coherently; and that alignment may need to be gotten right on a first critical try.</w:t>
+      </w:r>
+    </w:p>
+    <w:p>
+      <w:pPr>
+        <w:numPr>
+          <w:ilvl w:val="0"/>
+          <w:numId w:val="1001"/>
+        </w:numPr>
+        <w:pStyle w:val="Compact"/>
+      </w:pPr>
+      <w:r>
+        <w:t xml:space="preserve">Provided refresher notes (linked from the</w:t>
+      </w:r>
+      <w:r>
+        <w:t xml:space="preserve"> </w:t>
+      </w:r>
+      <w:hyperlink r:id="rId22">
+        <w:r>
+          <w:rPr>
+            <w:rStyle w:val="Hyperlink"/>
+          </w:rPr>
+          <w:t xml:space="preserve">Agent Foundations session page</w:t>
+        </w:r>
+      </w:hyperlink>
+      <w:r>
+        <w:t xml:space="preserve">) cover the gaps: a</w:t>
       </w:r>
       <w:r>
         <w:t xml:space="preserve"> </w:t>
@@ -353,11 +379,11 @@
         <w:t xml:space="preserve"> </w:t>
       </w:r>
       <w:r>
-        <w:t xml:space="preserve">refresher. Point students at the one matching their weakest area before the day.</w:t>
-      </w:r>
-    </w:p>
-    <w:bookmarkEnd w:id="22"/>
-    <w:bookmarkStart w:id="69" w:name="content"/>
+        <w:t xml:space="preserve">refresher. Students should read the one matching their weakest area before the day.</w:t>
+      </w:r>
+    </w:p>
+    <w:bookmarkEnd w:id="23"/>
+    <w:bookmarkStart w:id="76" w:name="content"/>
     <w:p>
       <w:pPr>
         <w:pStyle w:val="Heading1"/>
@@ -376,7 +402,7 @@
       <w:r>
         <w:t xml:space="preserve"> </w:t>
       </w:r>
-      <w:hyperlink r:id="rId23">
+      <w:hyperlink r:id="rId24">
         <w:r>
           <w:rPr>
             <w:rStyle w:val="Hyperlink"/>
@@ -385,12 +411,26 @@
         </w:r>
       </w:hyperlink>
       <w:r>
-        <w:t xml:space="preserve">. Exercise sheet:</w:t>
-      </w:r>
-      <w:r>
-        <w:t xml:space="preserve"> </w:t>
-      </w:r>
-      <w:hyperlink r:id="rId24">
+        <w:t xml:space="preserve"> </w:t>
+      </w:r>
+      <w:r>
+        <w:t xml:space="preserve">(</w:t>
+      </w:r>
+      <w:hyperlink r:id="rId25">
+        <w:r>
+          <w:rPr>
+            <w:rStyle w:val="Hyperlink"/>
+          </w:rPr>
+          <w:t xml:space="preserve">editable LaTeX source</w:t>
+        </w:r>
+      </w:hyperlink>
+      <w:r>
+        <w:t xml:space="preserve">). Exercise sheet:</w:t>
+      </w:r>
+      <w:r>
+        <w:t xml:space="preserve"> </w:t>
+      </w:r>
+      <w:hyperlink r:id="rId26">
         <w:r>
           <w:rPr>
             <w:rStyle w:val="Hyperlink"/>
@@ -404,7 +444,7 @@
       <w:r>
         <w:t xml:space="preserve">(</w:t>
       </w:r>
-      <w:hyperlink r:id="rId25">
+      <w:hyperlink r:id="rId27">
         <w:r>
           <w:rPr>
             <w:rStyle w:val="Hyperlink"/>
@@ -413,10 +453,38 @@
         </w:r>
       </w:hyperlink>
       <w:r>
-        <w:t xml:space="preserve">).</w:t>
-      </w:r>
-    </w:p>
-    <w:bookmarkStart w:id="28" w:name="fast-track"/>
+        <w:t xml:space="preserve">;</w:t>
+      </w:r>
+      <w:r>
+        <w:t xml:space="preserve"> </w:t>
+      </w:r>
+      <w:hyperlink r:id="rId28">
+        <w:r>
+          <w:rPr>
+            <w:rStyle w:val="Hyperlink"/>
+          </w:rPr>
+          <w:t xml:space="preserve">LaTeX source</w:t>
+        </w:r>
+      </w:hyperlink>
+      <w:r>
+        <w:t xml:space="preserve">). All materials are also linked from the</w:t>
+      </w:r>
+      <w:r>
+        <w:t xml:space="preserve"> </w:t>
+      </w:r>
+      <w:hyperlink r:id="rId22">
+        <w:r>
+          <w:rPr>
+            <w:rStyle w:val="Hyperlink"/>
+          </w:rPr>
+          <w:t xml:space="preserve">Agent Foundations session page</w:t>
+        </w:r>
+      </w:hyperlink>
+      <w:r>
+        <w:t xml:space="preserve">.</w:t>
+      </w:r>
+    </w:p>
+    <w:bookmarkStart w:id="31" w:name="fast-track"/>
     <w:p>
       <w:pPr>
         <w:pStyle w:val="Heading2"/>
@@ -477,7 +545,7 @@
       <w:r>
         <w:t xml:space="preserve"> </w:t>
       </w:r>
-      <w:hyperlink r:id="rId26">
+      <w:hyperlink r:id="rId29">
         <w:r>
           <w:rPr>
             <w:rStyle w:val="Hyperlink"/>
@@ -494,7 +562,7 @@
       <w:r>
         <w:t xml:space="preserve"> </w:t>
       </w:r>
-      <w:hyperlink r:id="rId27">
+      <w:hyperlink r:id="rId30">
         <w:r>
           <w:rPr>
             <w:rStyle w:val="Hyperlink"/>
@@ -527,7 +595,7 @@
         <w:t xml:space="preserve">“</w:t>
       </w:r>
       <w:r>
-        <w:t xml:space="preserve">The five strands</w:t>
+        <w:t xml:space="preserve">The five strands (pre-reading tracks)</w:t>
       </w:r>
       <w:r>
         <w:t xml:space="preserve">”</w:t>
@@ -548,11 +616,11 @@
         <w:pStyle w:val="Compact"/>
       </w:pPr>
       <w:r>
-        <w:t xml:space="preserve">Skim the takeaways at the end of each strand summary.</w:t>
-      </w:r>
-    </w:p>
-    <w:bookmarkEnd w:id="28"/>
-    <w:bookmarkStart w:id="53" w:name="main-content"/>
+        <w:t xml:space="preserve">Skim the italicized takeaway in each strand summary.</w:t>
+      </w:r>
+    </w:p>
+    <w:bookmarkEnd w:id="31"/>
+    <w:bookmarkStart w:id="57" w:name="main-content"/>
     <w:p>
       <w:pPr>
         <w:pStyle w:val="Heading2"/>
@@ -606,10 +674,10 @@
         <w:pStyle w:val="BodyText"/>
       </w:pPr>
       <w:r>
-        <w:t xml:space="preserve">Read top to bottom, this section runs: the unifying threads (the morning lecture), then the fundamental readings that give a bird’s-eye view, then the five strands each with its readings, then the cross-pollination discussion, the exercises, and a self-check.</w:t>
-      </w:r>
-    </w:p>
-    <w:bookmarkStart w:id="29" w:name="morning-lecture"/>
+        <w:t xml:space="preserve">Read top to bottom, this section runs: the unifying spine (the morning lecture), then the fundamental readings that give a bird’s-eye view, then the five strands each with its readings, then the cross-pollination discussion, the exercises, and the daily checkpoint.</w:t>
+      </w:r>
+    </w:p>
+    <w:bookmarkStart w:id="32" w:name="morning-lecture"/>
     <w:p>
       <w:pPr>
         <w:pStyle w:val="Heading3"/>
@@ -768,7 +836,7 @@
         <w:t xml:space="preserve"> </w:t>
       </w:r>
       <w:r>
-        <w:t xml:space="preserve">of optimization, goals, world models, and embeddedness.</w:t>
+        <w:t xml:space="preserve">of optimization, goals, world models, and embeddedness. (Spoken framing; this bullet has no slide of its own.)</w:t>
       </w:r>
     </w:p>
     <w:p>
@@ -884,8 +952,8 @@
         <w:t xml:space="preserve">: part of the world, made of the same pieces, smaller than its environment, with no crisp boundary, and able to be copied, modified, or to model itself. Embeddedness is what makes self-improvement, multi-agent reasoning about copies, and self-reference unavoidable, and it is what the rest of the day is about.</w:t>
       </w:r>
     </w:p>
-    <w:bookmarkEnd w:id="29"/>
-    <w:bookmarkStart w:id="32" w:name="fundamental-reading"/>
+    <w:bookmarkEnd w:id="32"/>
+    <w:bookmarkStart w:id="35" w:name="fundamental-reading"/>
     <w:p>
       <w:pPr>
         <w:pStyle w:val="Heading3"/>
@@ -914,7 +982,7 @@
         </w:numPr>
         <w:pStyle w:val="Compact"/>
       </w:pPr>
-      <w:hyperlink r:id="rId26">
+      <w:hyperlink r:id="rId29">
         <w:r>
           <w:rPr>
             <w:rStyle w:val="Hyperlink"/>
@@ -934,7 +1002,7 @@
         </w:numPr>
         <w:pStyle w:val="Compact"/>
       </w:pPr>
-      <w:hyperlink r:id="rId27">
+      <w:hyperlink r:id="rId30">
         <w:r>
           <w:rPr>
             <w:rStyle w:val="Hyperlink"/>
@@ -954,7 +1022,7 @@
         </w:numPr>
         <w:pStyle w:val="Compact"/>
       </w:pPr>
-      <w:hyperlink r:id="rId30">
+      <w:hyperlink r:id="rId33">
         <w:r>
           <w:rPr>
             <w:rStyle w:val="Hyperlink"/>
@@ -974,7 +1042,7 @@
         </w:numPr>
         <w:pStyle w:val="Compact"/>
       </w:pPr>
-      <w:hyperlink r:id="rId31">
+      <w:hyperlink r:id="rId34">
         <w:r>
           <w:rPr>
             <w:rStyle w:val="Hyperlink"/>
@@ -986,8 +1054,8 @@
         <w:t xml:space="preserve">: read entirely. Why a capable mind plausibly contains a retargetable search process.</w:t>
       </w:r>
     </w:p>
-    <w:bookmarkEnd w:id="32"/>
-    <w:bookmarkStart w:id="48" w:name="the-five-strands-pre-reading-tracks"/>
+    <w:bookmarkEnd w:id="35"/>
+    <w:bookmarkStart w:id="52" w:name="the-five-strands-pre-reading-tracks"/>
     <w:p>
       <w:pPr>
         <w:pStyle w:val="Heading3"/>
@@ -1005,7 +1073,80 @@
           <w:iCs/>
           <w:i/>
         </w:rPr>
-        <w:t xml:space="preserve">The five strands are different facets of one problem, embedded agency; each student pre-reads one. Every summary below is self-contained at the conceptual level and ends with that strand’s readings (start with the first listed, which is the most conceptual). The morning lecture previews all five; the cross-pollination discussion connects them.</w:t>
+        <w:t xml:space="preserve">The five strands are different facets of one problem, embedded agency; each student pre-reads one before the day, choosing a track on the</w:t>
+      </w:r>
+      <w:r>
+        <w:rPr>
+          <w:iCs/>
+          <w:i/>
+        </w:rPr>
+        <w:t xml:space="preserve"> </w:t>
+      </w:r>
+      <w:hyperlink r:id="rId36">
+        <w:r>
+          <w:rPr>
+            <w:rStyle w:val="Hyperlink"/>
+            <w:iCs/>
+            <w:i/>
+          </w:rPr>
+          <w:t xml:space="preserve">sign-up sheet</w:t>
+        </w:r>
+      </w:hyperlink>
+      <w:r>
+        <w:rPr>
+          <w:iCs/>
+          <w:i/>
+        </w:rPr>
+        <w:t xml:space="preserve"> </w:t>
+      </w:r>
+      <w:r>
+        <w:rPr>
+          <w:iCs/>
+          <w:i/>
+        </w:rPr>
+        <w:t xml:space="preserve">(see</w:t>
+      </w:r>
+      <w:r>
+        <w:rPr>
+          <w:iCs/>
+          <w:i/>
+        </w:rPr>
+        <w:t xml:space="preserve"> </w:t>
+      </w:r>
+      <w:r>
+        <w:rPr>
+          <w:iCs/>
+          <w:i/>
+        </w:rPr>
+        <w:t xml:space="preserve">“</w:t>
+      </w:r>
+      <w:r>
+        <w:rPr>
+          <w:iCs/>
+          <w:i/>
+        </w:rPr>
+        <w:t xml:space="preserve">Before the day</w:t>
+      </w:r>
+      <w:r>
+        <w:rPr>
+          <w:iCs/>
+          <w:i/>
+        </w:rPr>
+        <w:t xml:space="preserve">”</w:t>
+      </w:r>
+      <w:r>
+        <w:rPr>
+          <w:iCs/>
+          <w:i/>
+        </w:rPr>
+        <w:t xml:space="preserve"> </w:t>
+      </w:r>
+      <w:r>
+        <w:rPr>
+          <w:iCs/>
+          <w:i/>
+        </w:rPr>
+        <w:t xml:space="preserve">in the teaching guide; because the reading happens pre-day, this sub-module has no time block in the schedule). Every summary below is self-contained at the conceptual level and ends with that strand’s readings (start with the first listed, which is the most conceptual). The morning lecture previews all five; the cross-pollination discussion connects them.</w:t>
       </w:r>
     </w:p>
     <w:p>
@@ -1109,7 +1250,7 @@
       <w:r>
         <w:t xml:space="preserve"> </w:t>
       </w:r>
-      <w:hyperlink r:id="rId33">
+      <w:hyperlink r:id="rId37">
         <w:r>
           <w:rPr>
             <w:rStyle w:val="Hyperlink"/>
@@ -1174,7 +1315,7 @@
       <w:r>
         <w:t xml:space="preserve"> </w:t>
       </w:r>
-      <w:hyperlink r:id="rId34">
+      <w:hyperlink r:id="rId38">
         <w:r>
           <w:rPr>
             <w:rStyle w:val="Hyperlink"/>
@@ -1188,7 +1329,7 @@
       <w:r>
         <w:t xml:space="preserve"> </w:t>
       </w:r>
-      <w:hyperlink r:id="rId35">
+      <w:hyperlink r:id="rId39">
         <w:r>
           <w:rPr>
             <w:rStyle w:val="Hyperlink"/>
@@ -1421,7 +1562,7 @@
       <w:r>
         <w:t xml:space="preserve"> </w:t>
       </w:r>
-      <w:hyperlink r:id="rId36">
+      <w:hyperlink r:id="rId40">
         <w:r>
           <w:rPr>
             <w:rStyle w:val="Hyperlink"/>
@@ -1438,7 +1579,7 @@
       <w:r>
         <w:t xml:space="preserve"> </w:t>
       </w:r>
-      <w:hyperlink r:id="rId37">
+      <w:hyperlink r:id="rId41">
         <w:r>
           <w:rPr>
             <w:rStyle w:val="Hyperlink"/>
@@ -1452,7 +1593,7 @@
       <w:r>
         <w:t xml:space="preserve"> </w:t>
       </w:r>
-      <w:hyperlink r:id="rId38">
+      <w:hyperlink r:id="rId42">
         <w:r>
           <w:rPr>
             <w:rStyle w:val="Hyperlink"/>
@@ -1616,7 +1757,7 @@
       <w:r>
         <w:t xml:space="preserve"> </w:t>
       </w:r>
-      <w:hyperlink r:id="rId39">
+      <w:hyperlink r:id="rId43">
         <w:r>
           <w:rPr>
             <w:rStyle w:val="Hyperlink"/>
@@ -1630,7 +1771,7 @@
       <w:r>
         <w:t xml:space="preserve"> </w:t>
       </w:r>
-      <w:hyperlink r:id="rId40">
+      <w:hyperlink r:id="rId44">
         <w:r>
           <w:rPr>
             <w:rStyle w:val="Hyperlink"/>
@@ -1881,7 +2022,7 @@
       <w:r>
         <w:t xml:space="preserve"> </w:t>
       </w:r>
-      <w:hyperlink r:id="rId41">
+      <w:hyperlink r:id="rId45">
         <w:r>
           <w:rPr>
             <w:rStyle w:val="Hyperlink"/>
@@ -1898,7 +2039,7 @@
       <w:r>
         <w:t xml:space="preserve"> </w:t>
       </w:r>
-      <w:hyperlink r:id="rId42">
+      <w:hyperlink r:id="rId46">
         <w:r>
           <w:rPr>
             <w:rStyle w:val="Hyperlink"/>
@@ -1930,7 +2071,7 @@
       <w:r>
         <w:t xml:space="preserve"> </w:t>
       </w:r>
-      <w:hyperlink r:id="rId43">
+      <w:hyperlink r:id="rId47">
         <w:r>
           <w:rPr>
             <w:rStyle w:val="Hyperlink"/>
@@ -1944,7 +2085,7 @@
       <w:r>
         <w:t xml:space="preserve"> </w:t>
       </w:r>
-      <w:hyperlink r:id="rId44">
+      <w:hyperlink r:id="rId48">
         <w:r>
           <w:rPr>
             <w:rStyle w:val="Hyperlink"/>
@@ -2139,7 +2280,7 @@
       <w:r>
         <w:t xml:space="preserve"> </w:t>
       </w:r>
-      <w:hyperlink r:id="rId45">
+      <w:hyperlink r:id="rId49">
         <w:r>
           <w:rPr>
             <w:rStyle w:val="Hyperlink"/>
@@ -2153,7 +2294,7 @@
       <w:r>
         <w:t xml:space="preserve"> </w:t>
       </w:r>
-      <w:hyperlink r:id="rId46">
+      <w:hyperlink r:id="rId50">
         <w:r>
           <w:rPr>
             <w:rStyle w:val="Hyperlink"/>
@@ -2167,7 +2308,7 @@
       <w:r>
         <w:t xml:space="preserve"> </w:t>
       </w:r>
-      <w:hyperlink r:id="rId47">
+      <w:hyperlink r:id="rId51">
         <w:r>
           <w:rPr>
             <w:rStyle w:val="Hyperlink"/>
@@ -2179,8 +2320,8 @@
         <w:t xml:space="preserve">.</w:t>
       </w:r>
     </w:p>
-    <w:bookmarkEnd w:id="48"/>
-    <w:bookmarkStart w:id="49" w:name="cross-pollination-discussion"/>
+    <w:bookmarkEnd w:id="52"/>
+    <w:bookmarkStart w:id="53" w:name="cross-pollination-discussion"/>
     <w:p>
       <w:pPr>
         <w:pStyle w:val="Heading3"/>
@@ -2198,7 +2339,7 @@
           <w:iCs/>
           <w:i/>
         </w:rPr>
-        <w:t xml:space="preserve">Intent: each student knows one strand deeply; the discussion makes them build the connections between strands, which is where the unified picture of embedded agency actually lives. Groups mix tracks so no one can answer alone.</w:t>
+        <w:t xml:space="preserve">Intent: each student knows one strand deeply; the discussion first spreads that exposure across the room (each member teaches their strand), then builds connections between strands. Groups mix tracks so no one can answer alone. Taught once: the cross-exposure proved the more valuable half, so the connection prompts are an extension for strong groups rather than the default activity.</w:t>
       </w:r>
     </w:p>
     <w:p>
@@ -2209,8 +2350,8 @@
         <w:t xml:space="preserve">On the day, students who pre-read different strands meet in small mixed groups and work to connect their topics into one picture of embedded agency: how a logical inductor’s trust in its future self relates to a tiling agent’s trust in its successor, how the coherence account of goals relates to the thermodynamic one, how the representational view of agency (coherence) relates to the mechanistic one (selection theorems). The specific discussion prompts used are listed in the teaching guide.</w:t>
       </w:r>
     </w:p>
-    <w:bookmarkEnd w:id="49"/>
-    <w:bookmarkStart w:id="50" w:name="exercise-session"/>
+    <w:bookmarkEnd w:id="53"/>
+    <w:bookmarkStart w:id="54" w:name="exercise-session"/>
     <w:p>
       <w:pPr>
         <w:pStyle w:val="Heading3"/>
@@ -2241,7 +2382,7 @@
       <w:r>
         <w:t xml:space="preserve"> </w:t>
       </w:r>
-      <w:hyperlink r:id="rId24">
+      <w:hyperlink r:id="rId26">
         <w:r>
           <w:rPr>
             <w:rStyle w:val="Hyperlink"/>
@@ -2255,7 +2396,7 @@
       <w:r>
         <w:t xml:space="preserve"> </w:t>
       </w:r>
-      <w:hyperlink r:id="rId25">
+      <w:hyperlink r:id="rId27">
         <w:r>
           <w:rPr>
             <w:rStyle w:val="Hyperlink"/>
@@ -2298,7 +2439,7 @@
         <w:t xml:space="preserve"> </w:t>
       </w:r>
       <w:r>
-        <w:t xml:space="preserve">(difficulty 4/5, importance 4/5). Via a self-referential program: a Gödel sentence is true, a consistent system cannot prove its own consistency, and this is exactly the Löbian obstacle to self-trust. Parts (a) true Gödel sentence, (b) no self-consistency proof, (c) the obstacle.</w:t>
+        <w:t xml:space="preserve">(difficulty 4/5, importance 4/5, ~45 min). Via a self-referential program: a Gödel sentence is true, a consistent system cannot prove its own consistency, and this is exactly the Löbian obstacle to self-trust. Parts (a) true Gödel sentence, (b) no self-consistency proof, (c) the obstacle.</w:t>
       </w:r>
     </w:p>
     <w:p>
@@ -2320,7 +2461,7 @@
         <w:t xml:space="preserve"> </w:t>
       </w:r>
       <w:r>
-        <w:t xml:space="preserve">(difficulty 3/5, importance 5/5). The three provability properties (necessitation, distribution, the Löb condition), a full proof of the theorem, and an application: FairBot programs cooperate by Löb’s theorem. Parts (a-b) properties, (c-d) the proof, (e) FairBot.</w:t>
+        <w:t xml:space="preserve">(difficulty 3/5, importance 5/5, ~45 min). The three provability properties (necessitation, distribution, the Löb condition), a full proof of the theorem, and an application: FairBot programs cooperate by Löb’s theorem. Parts (a-b) explain two of the three properties (the Löb condition is stated and used as given), (c-d) the proof, (e) FairBot.</w:t>
       </w:r>
     </w:p>
     <w:p>
@@ -2354,7 +2495,7 @@
         <w:t xml:space="preserve"> </w:t>
       </w:r>
       <w:r>
-        <w:t xml:space="preserve">(difficulty 3/5, importance 5/5). The equivalence between non-dominated strategies and Bayesian expected-utility maximization, via a geometric argument over the convex set of attainable reward vectors. Parts (a) admissibility, (b) faces and difference vectors, (c) constructing the rationalizing prior.</w:t>
+        <w:t xml:space="preserve">(difficulty 3/5, importance 5/5, ~40 min). The equivalence between non-dominated strategies and Bayesian expected-utility maximization, via a geometric argument over the convex set of attainable reward vectors. Parts (a) admissibility, (b) faces and difference vectors, (c) constructing the rationalizing prior.</w:t>
       </w:r>
     </w:p>
     <w:p>
@@ -2366,6 +2507,40 @@
           <w:iCs/>
           <w:i/>
         </w:rPr>
+        <w:t xml:space="preserve">Optimization and thermodynamics.</w:t>
+      </w:r>
+    </w:p>
+    <w:p>
+      <w:pPr>
+        <w:numPr>
+          <w:ilvl w:val="0"/>
+          <w:numId w:val="1007"/>
+        </w:numPr>
+        <w:pStyle w:val="Compact"/>
+      </w:pPr>
+      <w:r>
+        <w:rPr>
+          <w:bCs/>
+          <w:b/>
+        </w:rPr>
+        <w:t xml:space="preserve">Exercise 4: The do-divergence theorem</w:t>
+      </w:r>
+      <w:r>
+        <w:t xml:space="preserve"> </w:t>
+      </w:r>
+      <w:r>
+        <w:t xml:space="preserve">(difficulty 2/5, importance 4/5, ~20 min). Formalizes optimization as outcome concentration and proves that how far an agent can steer outcomes (a KL divergence from the unsteered baseline) is bounded by the mutual information between its observations and actions. The single-step backbone of the Touchette-Lloyd picture.</w:t>
+      </w:r>
+    </w:p>
+    <w:p>
+      <w:pPr>
+        <w:pStyle w:val="FirstParagraph"/>
+      </w:pPr>
+      <w:r>
+        <w:rPr>
+          <w:iCs/>
+          <w:i/>
+        </w:rPr>
         <w:t xml:space="preserve">Descriptive agent foundations.</w:t>
       </w:r>
     </w:p>
@@ -2373,29 +2548,7 @@
       <w:pPr>
         <w:numPr>
           <w:ilvl w:val="0"/>
-          <w:numId w:val="1007"/>
-        </w:numPr>
-        <w:pStyle w:val="Compact"/>
-      </w:pPr>
-      <w:r>
-        <w:rPr>
-          <w:bCs/>
-          <w:b/>
-        </w:rPr>
-        <w:t xml:space="preserve">Exercise 4: The do-divergence theorem</w:t>
-      </w:r>
-      <w:r>
-        <w:t xml:space="preserve"> </w:t>
-      </w:r>
-      <w:r>
-        <w:t xml:space="preserve">(difficulty 2/5, importance 4/5). Formalizes optimization as outcome concentration and proves that how far an agent can steer outcomes (a KL divergence from the unsteered baseline) is bounded by the mutual information between its observations and actions. The single-step backbone of the Touchette-Lloyd picture.</w:t>
-      </w:r>
-    </w:p>
-    <w:p>
-      <w:pPr>
-        <w:numPr>
-          <w:ilvl w:val="0"/>
-          <w:numId w:val="1007"/>
+          <w:numId w:val="1008"/>
         </w:numPr>
         <w:pStyle w:val="Compact"/>
       </w:pPr>
@@ -2410,11 +2563,11 @@
         <w:t xml:space="preserve"> </w:t>
       </w:r>
       <w:r>
-        <w:t xml:space="preserve">(difficulty 3/5, importance 3/5). Optimal input distributions over independent channels: mutual information decomposes across channels, independence improves throughput, and an optimal policy need not coordinate across a modular environment (connecting modularity to tractable optimization).</w:t>
-      </w:r>
-    </w:p>
-    <w:bookmarkEnd w:id="50"/>
-    <w:bookmarkStart w:id="52" w:name="daily-checkpoint"/>
+        <w:t xml:space="preserve">(difficulty 3/5, importance 3/5, ~30 min). Optimal input distributions over independent channels: mutual information decomposes across channels, independence improves throughput, and an optimal policy need not coordinate across a modular environment (connecting modularity to tractable optimization).</w:t>
+      </w:r>
+    </w:p>
+    <w:bookmarkEnd w:id="54"/>
+    <w:bookmarkStart w:id="56" w:name="daily-checkpoint"/>
     <w:p>
       <w:pPr>
         <w:pStyle w:val="Heading3"/>
@@ -2440,12 +2593,12 @@
         <w:pStyle w:val="BodyText"/>
       </w:pPr>
       <w:r>
-        <w:t xml:space="preserve">The live form used on the day:</w:t>
-      </w:r>
-      <w:r>
-        <w:t xml:space="preserve"> </w:t>
-      </w:r>
-      <w:hyperlink r:id="rId51">
+        <w:t xml:space="preserve">The live form used on the day (13 questions):</w:t>
+      </w:r>
+      <w:r>
+        <w:t xml:space="preserve"> </w:t>
+      </w:r>
+      <w:hyperlink r:id="rId55">
         <w:r>
           <w:rPr>
             <w:rStyle w:val="Hyperlink"/>
@@ -2454,14 +2607,14 @@
         </w:r>
       </w:hyperlink>
       <w:r>
-        <w:t xml:space="preserve">. The questions below are a self-contained version; answers at the end of this section.</w:t>
-      </w:r>
-    </w:p>
-    <w:p>
-      <w:pPr>
-        <w:numPr>
-          <w:ilvl w:val="0"/>
-          <w:numId w:val="1008"/>
+        <w:t xml:space="preserve">. The seven questions below are a self-contained core version; the answer key is in the teaching guide’s Daily checkpoint section.</w:t>
+      </w:r>
+    </w:p>
+    <w:p>
+      <w:pPr>
+        <w:numPr>
+          <w:ilvl w:val="0"/>
+          <w:numId w:val="1009"/>
         </w:numPr>
         <w:pStyle w:val="Compact"/>
       </w:pPr>
@@ -2479,19 +2632,19 @@
         <w:t xml:space="preserve">reflectively stable</w:t>
       </w:r>
       <w:r>
-        <w:t xml:space="preserve">? (a) It holds on the training distribution. (b) It is invariant under the agent’s self-modification and successor-building. (c) It can be expressed in formal logic. (d) It maximizes expected utility.</w:t>
-      </w:r>
-    </w:p>
-    <w:p>
-      <w:pPr>
-        <w:numPr>
-          <w:ilvl w:val="0"/>
-          <w:numId w:val="1008"/>
-        </w:numPr>
-        <w:pStyle w:val="Compact"/>
-      </w:pPr>
-      <w:r>
-        <w:t xml:space="preserve">The complete class theorem tells us that a non-dominated agent: (a) has an explicit utility function in its code; (b) can be</w:t>
+        <w:t xml:space="preserve">? (a) It holds on the training distribution and all test distributions. (b) It is invariant under the agent’s self-modification and successor-building. (c) It is provable within the agent’s own formal system. (d) It maximizes the agent’s expected utility in every environment.</w:t>
+      </w:r>
+    </w:p>
+    <w:p>
+      <w:pPr>
+        <w:numPr>
+          <w:ilvl w:val="0"/>
+          <w:numId w:val="1009"/>
+        </w:numPr>
+        <w:pStyle w:val="Compact"/>
+      </w:pPr>
+      <w:r>
+        <w:t xml:space="preserve">The complete class theorem tells us that a non-dominated agent: (a) contains an explicit utility function somewhere in its implementation; (b) always agrees with every other non-dominated agent’s choices; (c) can be</w:t>
       </w:r>
       <w:r>
         <w:t xml:space="preserve"> </w:t>
@@ -2507,14 +2660,14 @@
         <w:t xml:space="preserve"> </w:t>
       </w:r>
       <w:r>
-        <w:t xml:space="preserve">as maximizing expected utility under some prior; (c) is conscious; (d) must use causal decision theory.</w:t>
-      </w:r>
-    </w:p>
-    <w:p>
-      <w:pPr>
-        <w:numPr>
-          <w:ilvl w:val="0"/>
-          <w:numId w:val="1008"/>
+        <w:t xml:space="preserve">as maximizing expected utility under some prior; (d) must represent its beliefs as a single Bayesian network.</w:t>
+      </w:r>
+    </w:p>
+    <w:p>
+      <w:pPr>
+        <w:numPr>
+          <w:ilvl w:val="0"/>
+          <w:numId w:val="1009"/>
         </w:numPr>
         <w:pStyle w:val="Compact"/>
       </w:pPr>
@@ -2537,19 +2690,19 @@
         <w:t xml:space="preserve"> </w:t>
       </w:r>
       <w:r>
-        <w:t xml:space="preserve">to license self-modification? (a) Proofs are too slow. (b) Löb’s theorem: provable self-trust collapses into proving everything. (c) It lacks enough memory. (d) Gödel sentences are false.</w:t>
-      </w:r>
-    </w:p>
-    <w:p>
-      <w:pPr>
-        <w:numPr>
-          <w:ilvl w:val="0"/>
-          <w:numId w:val="1008"/>
-        </w:numPr>
-        <w:pStyle w:val="Compact"/>
-      </w:pPr>
-      <w:r>
-        <w:t xml:space="preserve">The logical-induction criterion requires that: (a) no trader at all can exploit the market; (b) no</w:t>
+        <w:t xml:space="preserve">to license self-modification? (a) By Löb’s theorem, provable self-trust collapses into proving everything. (b) By Gödel’s first incompleteness theorem, some truths about the successor are unprovable. (c) Because proof search is uncomputable in general. (d) Because the successor’s proof system is stronger than the parent’s.</w:t>
+      </w:r>
+    </w:p>
+    <w:p>
+      <w:pPr>
+        <w:numPr>
+          <w:ilvl w:val="0"/>
+          <w:numId w:val="1009"/>
+        </w:numPr>
+        <w:pStyle w:val="Compact"/>
+      </w:pPr>
+      <w:r>
+        <w:t xml:space="preserve">The logical-induction criterion requires that: (a) no trader at all can exploit the market; (b) prices converge to the true frequencies after finitely many steps; (c) the market becomes logically omniscient in the limit; (d) no</w:t>
       </w:r>
       <w:r>
         <w:t xml:space="preserve"> </w:t>
@@ -2565,14 +2718,14 @@
         <w:t xml:space="preserve"> </w:t>
       </w:r>
       <w:r>
-        <w:t xml:space="preserve">trader can exploit the market for unbounded profit; (c) prices equal frequencies; (d) the agent is logically omniscient.</w:t>
-      </w:r>
-    </w:p>
-    <w:p>
-      <w:pPr>
-        <w:numPr>
-          <w:ilvl w:val="0"/>
-          <w:numId w:val="1008"/>
+        <w:t xml:space="preserve">trader can exploit the market for unbounded profit.</w:t>
+      </w:r>
+    </w:p>
+    <w:p>
+      <w:pPr>
+        <w:numPr>
+          <w:ilvl w:val="0"/>
+          <w:numId w:val="1009"/>
         </w:numPr>
         <w:pStyle w:val="Compact"/>
       </w:pPr>
@@ -2589,19 +2742,42 @@
         <w:t xml:space="preserve"> </w:t>
       </w:r>
       <w:r>
-        <w:t xml:space="preserve">plus Touchette-Lloyd implies: (a) entropy never decreases anywhere; (b) steering beyond a blind baseline is bounded by the agent’s mutual information with what it steers; (c) optimization is impossible; (d) entropy is subjective.</w:t>
-      </w:r>
-    </w:p>
-    <w:p>
-      <w:pPr>
-        <w:numPr>
-          <w:ilvl w:val="0"/>
-          <w:numId w:val="1008"/>
-        </w:numPr>
-        <w:pStyle w:val="Compact"/>
-      </w:pPr>
-      <w:r>
-        <w:t xml:space="preserve">Selection theorems aim to show that: (a) any non-dominated strategy can be described as EU maximization; (b) systems selected to achieve a goal in an environment must contain certain agent-like structure; (c) evolution is optimal; (d) all agents are Bayesian.</w:t>
+        <w:t xml:space="preserve">plus Touchette-Lloyd implies: (a) a sighted agent can reduce entropy by at most as much as a blind one; (b) steering beyond the blind baseline is bounded by the mutual information between the agent’s observations and actions; (c) entropy reduction in the environment requires equal entropy production inside the agent; (d) only agents with complete world models can reduce entropy at all.</w:t>
+      </w:r>
+    </w:p>
+    <w:p>
+      <w:pPr>
+        <w:numPr>
+          <w:ilvl w:val="0"/>
+          <w:numId w:val="1009"/>
+        </w:numPr>
+        <w:pStyle w:val="Compact"/>
+      </w:pPr>
+      <w:r>
+        <w:t xml:space="preserve">Selection theorems aim to show that: (a) systems selected to achieve a goal in an environment must contain certain agent-like structure; (b) any non-dominated strategy can be described as EU maximization; (c) evolution selects exactly for expected-utility maximizers; (d) all sufficiently trained systems become Bayesian reasoners.</w:t>
+      </w:r>
+    </w:p>
+    <w:p>
+      <w:pPr>
+        <w:numPr>
+          <w:ilvl w:val="0"/>
+          <w:numId w:val="1009"/>
+        </w:numPr>
+        <w:pStyle w:val="Compact"/>
+      </w:pPr>
+      <w:r>
+        <w:t xml:space="preserve">Which of these is NOT part of the embedded (as opposed to dualistic) picture of agency? (a) The agent has no clean input/output boundary with its environment. (b) The agent is smaller than the environment it models. (c) The agent holds a complete model of its world in its head. (d) The agent can be copied or modified by processes in the environment.</w:t>
+      </w:r>
+    </w:p>
+    <w:bookmarkEnd w:id="56"/>
+    <w:bookmarkEnd w:id="57"/>
+    <w:bookmarkStart w:id="75" w:name="learn-more"/>
+    <w:p>
+      <w:pPr>
+        <w:pStyle w:val="Heading2"/>
+      </w:pPr>
+      <w:r>
+        <w:t xml:space="preserve">Learn more</w:t>
       </w:r>
     </w:p>
     <w:p>
@@ -2609,29 +2785,6 @@
         <w:pStyle w:val="FirstParagraph"/>
       </w:pPr>
       <w:r>
-        <w:rPr>
-          <w:iCs/>
-          <w:i/>
-        </w:rPr>
-        <w:t xml:space="preserve">Answers: 1(b), 2(b), 3(b), 4(b), 5(b), 6(b).</w:t>
-      </w:r>
-    </w:p>
-    <w:bookmarkEnd w:id="52"/>
-    <w:bookmarkEnd w:id="53"/>
-    <w:bookmarkStart w:id="68" w:name="learn-more"/>
-    <w:p>
-      <w:pPr>
-        <w:pStyle w:val="Heading2"/>
-      </w:pPr>
-      <w:r>
-        <w:t xml:space="preserve">Learn more</w:t>
-      </w:r>
-    </w:p>
-    <w:p>
-      <w:pPr>
-        <w:pStyle w:val="FirstParagraph"/>
-      </w:pPr>
-      <w:r>
         <w:t xml:space="preserve">The readings for each strand are linked under that strand in the Main content above. Beyond them:</w:t>
       </w:r>
     </w:p>
@@ -2644,12 +2797,18 @@
           <w:bCs/>
           <w:b/>
         </w:rPr>
-        <w:t xml:space="preserve">Algorithmic thermodynamics (Ebtekar).</w:t>
-      </w:r>
-      <w:r>
-        <w:t xml:space="preserve"> </w:t>
-      </w:r>
-      <w:hyperlink r:id="rId54">
+        <w:t xml:space="preserve">Algorithmic thermodynamics (deepening the optimization strand).</w:t>
+      </w:r>
+    </w:p>
+    <w:p>
+      <w:pPr>
+        <w:numPr>
+          <w:ilvl w:val="0"/>
+          <w:numId w:val="1010"/>
+        </w:numPr>
+        <w:pStyle w:val="Compact"/>
+      </w:pPr>
+      <w:hyperlink r:id="rId58">
         <w:r>
           <w:rPr>
             <w:rStyle w:val="Hyperlink"/>
@@ -2658,12 +2817,18 @@
         </w:r>
       </w:hyperlink>
       <w:r>
-        <w:t xml:space="preserve">;</w:t>
-      </w:r>
-      <w:r>
-        <w:t xml:space="preserve"> </w:t>
-      </w:r>
-      <w:hyperlink r:id="rId55">
+        <w:t xml:space="preserve">: the formal backbone behind the optimization-and-thermodynamics note.</w:t>
+      </w:r>
+    </w:p>
+    <w:p>
+      <w:pPr>
+        <w:numPr>
+          <w:ilvl w:val="0"/>
+          <w:numId w:val="1010"/>
+        </w:numPr>
+        <w:pStyle w:val="Compact"/>
+      </w:pPr>
+      <w:hyperlink r:id="rId59">
         <w:r>
           <w:rPr>
             <w:rStyle w:val="Hyperlink"/>
@@ -2672,12 +2837,18 @@
         </w:r>
       </w:hyperlink>
       <w:r>
-        <w:t xml:space="preserve">;</w:t>
-      </w:r>
-      <w:r>
-        <w:t xml:space="preserve"> </w:t>
-      </w:r>
-      <w:hyperlink r:id="rId56">
+        <w:t xml:space="preserve">: how irreversibility emerges from reversible dynamics.</w:t>
+      </w:r>
+    </w:p>
+    <w:p>
+      <w:pPr>
+        <w:numPr>
+          <w:ilvl w:val="0"/>
+          <w:numId w:val="1010"/>
+        </w:numPr>
+        <w:pStyle w:val="Compact"/>
+      </w:pPr>
+      <w:hyperlink r:id="rId60">
         <w:r>
           <w:rPr>
             <w:rStyle w:val="Hyperlink"/>
@@ -2686,24 +2857,30 @@
         </w:r>
       </w:hyperlink>
       <w:r>
-        <w:t xml:space="preserve">.</w:t>
-      </w:r>
-    </w:p>
-    <w:p>
-      <w:pPr>
-        <w:pStyle w:val="BodyText"/>
-      </w:pPr>
-      <w:r>
-        <w:rPr>
-          <w:bCs/>
-          <w:b/>
-        </w:rPr>
-        <w:t xml:space="preserve">Embedded and universal AI (Wyeth).</w:t>
-      </w:r>
-      <w:r>
-        <w:t xml:space="preserve"> </w:t>
-      </w:r>
-      <w:hyperlink r:id="rId57">
+        <w:t xml:space="preserve">: related rigorous kinetic theory.</w:t>
+      </w:r>
+    </w:p>
+    <w:p>
+      <w:pPr>
+        <w:pStyle w:val="FirstParagraph"/>
+      </w:pPr>
+      <w:r>
+        <w:rPr>
+          <w:bCs/>
+          <w:b/>
+        </w:rPr>
+        <w:t xml:space="preserve">Embedded and universal AI.</w:t>
+      </w:r>
+    </w:p>
+    <w:p>
+      <w:pPr>
+        <w:numPr>
+          <w:ilvl w:val="0"/>
+          <w:numId w:val="1011"/>
+        </w:numPr>
+        <w:pStyle w:val="Compact"/>
+      </w:pPr>
+      <w:hyperlink r:id="rId61">
         <w:r>
           <w:rPr>
             <w:rStyle w:val="Hyperlink"/>
@@ -2712,12 +2889,18 @@
         </w:r>
       </w:hyperlink>
       <w:r>
-        <w:t xml:space="preserve">;</w:t>
-      </w:r>
-      <w:r>
-        <w:t xml:space="preserve"> </w:t>
-      </w:r>
-      <w:hyperlink r:id="rId58">
+        <w:t xml:space="preserve">: multi-agent environments that contain their own predictors.</w:t>
+      </w:r>
+    </w:p>
+    <w:p>
+      <w:pPr>
+        <w:numPr>
+          <w:ilvl w:val="0"/>
+          <w:numId w:val="1011"/>
+        </w:numPr>
+        <w:pStyle w:val="Compact"/>
+      </w:pPr>
+      <w:hyperlink r:id="rId62">
         <w:r>
           <w:rPr>
             <w:rStyle w:val="Hyperlink"/>
@@ -2726,12 +2909,18 @@
         </w:r>
       </w:hyperlink>
       <w:r>
-        <w:t xml:space="preserve">;</w:t>
-      </w:r>
-      <w:r>
-        <w:t xml:space="preserve"> </w:t>
-      </w:r>
-      <w:hyperlink r:id="rId59">
+        <w:t xml:space="preserve">: where AIXI-style agents break as embedded agents.</w:t>
+      </w:r>
+    </w:p>
+    <w:p>
+      <w:pPr>
+        <w:numPr>
+          <w:ilvl w:val="0"/>
+          <w:numId w:val="1011"/>
+        </w:numPr>
+        <w:pStyle w:val="Compact"/>
+      </w:pPr>
+      <w:hyperlink r:id="rId63">
         <w:r>
           <w:rPr>
             <w:rStyle w:val="Hyperlink"/>
@@ -2740,12 +2929,12 @@
         </w:r>
       </w:hyperlink>
       <w:r>
-        <w:t xml:space="preserve">.</w:t>
-      </w:r>
-    </w:p>
-    <w:p>
-      <w:pPr>
-        <w:pStyle w:val="BodyText"/>
+        <w:t xml:space="preserve">: decision-making without a complete world model.</w:t>
+      </w:r>
+    </w:p>
+    <w:p>
+      <w:pPr>
+        <w:pStyle w:val="FirstParagraph"/>
       </w:pPr>
       <w:r>
         <w:rPr>
@@ -2754,10 +2943,16 @@
         </w:rPr>
         <w:t xml:space="preserve">Other directions.</w:t>
       </w:r>
-      <w:r>
-        <w:t xml:space="preserve"> </w:t>
-      </w:r>
-      <w:hyperlink r:id="rId60">
+    </w:p>
+    <w:p>
+      <w:pPr>
+        <w:numPr>
+          <w:ilvl w:val="0"/>
+          <w:numId w:val="1012"/>
+        </w:numPr>
+        <w:pStyle w:val="Compact"/>
+      </w:pPr>
+      <w:hyperlink r:id="rId64">
         <w:r>
           <w:rPr>
             <w:rStyle w:val="Hyperlink"/>
@@ -2766,15 +2961,18 @@
         </w:r>
       </w:hyperlink>
       <w:r>
-        <w:t xml:space="preserve"> </w:t>
-      </w:r>
-      <w:r>
-        <w:t xml:space="preserve">(non-realizable environments);</w:t>
-      </w:r>
-      <w:r>
-        <w:t xml:space="preserve"> </w:t>
-      </w:r>
-      <w:hyperlink r:id="rId61">
+        <w:t xml:space="preserve">: beliefs and guarantees in non-realizable environments.</w:t>
+      </w:r>
+    </w:p>
+    <w:p>
+      <w:pPr>
+        <w:numPr>
+          <w:ilvl w:val="0"/>
+          <w:numId w:val="1012"/>
+        </w:numPr>
+        <w:pStyle w:val="Compact"/>
+      </w:pPr>
+      <w:hyperlink r:id="rId65">
         <w:r>
           <w:rPr>
             <w:rStyle w:val="Hyperlink"/>
@@ -2783,12 +2981,18 @@
         </w:r>
       </w:hyperlink>
       <w:r>
-        <w:t xml:space="preserve">;</w:t>
-      </w:r>
-      <w:r>
-        <w:t xml:space="preserve"> </w:t>
-      </w:r>
-      <w:hyperlink r:id="rId62">
+        <w:t xml:space="preserve">: the broadest current statement of one agent-foundations research programme.</w:t>
+      </w:r>
+    </w:p>
+    <w:p>
+      <w:pPr>
+        <w:numPr>
+          <w:ilvl w:val="0"/>
+          <w:numId w:val="1012"/>
+        </w:numPr>
+        <w:pStyle w:val="Compact"/>
+      </w:pPr>
+      <w:hyperlink r:id="rId66">
         <w:r>
           <w:rPr>
             <w:rStyle w:val="Hyperlink"/>
@@ -2797,12 +3001,24 @@
         </w:r>
       </w:hyperlink>
       <w:r>
-        <w:t xml:space="preserve">; the</w:t>
-      </w:r>
-      <w:r>
-        <w:t xml:space="preserve"> </w:t>
-      </w:r>
-      <w:hyperlink r:id="rId63">
+        <w:t xml:space="preserve">: optimization exerted across space and time.</w:t>
+      </w:r>
+    </w:p>
+    <w:p>
+      <w:pPr>
+        <w:numPr>
+          <w:ilvl w:val="0"/>
+          <w:numId w:val="1012"/>
+        </w:numPr>
+        <w:pStyle w:val="Compact"/>
+      </w:pPr>
+      <w:r>
+        <w:t xml:space="preserve">The</w:t>
+      </w:r>
+      <w:r>
+        <w:t xml:space="preserve"> </w:t>
+      </w:r>
+      <w:hyperlink r:id="rId67">
         <w:r>
           <w:rPr>
             <w:rStyle w:val="Hyperlink"/>
@@ -2819,7 +3035,7 @@
       <w:r>
         <w:t xml:space="preserve"> </w:t>
       </w:r>
-      <w:hyperlink r:id="rId64">
+      <w:hyperlink r:id="rId68">
         <w:r>
           <w:rPr>
             <w:rStyle w:val="Hyperlink"/>
@@ -2828,12 +3044,42 @@
         </w:r>
       </w:hyperlink>
       <w:r>
-        <w:t xml:space="preserve">; the original</w:t>
-      </w:r>
-      <w:r>
-        <w:t xml:space="preserve"> </w:t>
-      </w:r>
-      <w:hyperlink r:id="rId65">
+        <w:t xml:space="preserve">: why</w:t>
+      </w:r>
+      <w:r>
+        <w:t xml:space="preserve"> </w:t>
+      </w:r>
+      <w:r>
+        <w:t xml:space="preserve">“</w:t>
+      </w:r>
+      <w:r>
+        <w:t xml:space="preserve">let us correct you</w:t>
+      </w:r>
+      <w:r>
+        <w:t xml:space="preserve">”</w:t>
+      </w:r>
+      <w:r>
+        <w:t xml:space="preserve"> </w:t>
+      </w:r>
+      <w:r>
+        <w:t xml:space="preserve">is hard to make reflectively stable.</w:t>
+      </w:r>
+    </w:p>
+    <w:p>
+      <w:pPr>
+        <w:numPr>
+          <w:ilvl w:val="0"/>
+          <w:numId w:val="1012"/>
+        </w:numPr>
+        <w:pStyle w:val="Compact"/>
+      </w:pPr>
+      <w:r>
+        <w:t xml:space="preserve">The original</w:t>
+      </w:r>
+      <w:r>
+        <w:t xml:space="preserve"> </w:t>
+      </w:r>
+      <w:hyperlink r:id="rId69">
         <w:r>
           <w:rPr>
             <w:rStyle w:val="Hyperlink"/>
@@ -2842,12 +3088,12 @@
         </w:r>
       </w:hyperlink>
       <w:r>
-        <w:t xml:space="preserve">; and background notes on</w:t>
-      </w:r>
-      <w:r>
-        <w:t xml:space="preserve"> </w:t>
-      </w:r>
-      <w:hyperlink r:id="rId66">
+        <w:t xml:space="preserve">, plus background notes on</w:t>
+      </w:r>
+      <w:r>
+        <w:t xml:space="preserve"> </w:t>
+      </w:r>
+      <w:hyperlink r:id="rId70">
         <w:r>
           <w:rPr>
             <w:rStyle w:val="Hyperlink"/>
@@ -2864,7 +3110,7 @@
       <w:r>
         <w:t xml:space="preserve"> </w:t>
       </w:r>
-      <w:hyperlink r:id="rId67">
+      <w:hyperlink r:id="rId71">
         <w:r>
           <w:rPr>
             <w:rStyle w:val="Hyperlink"/>
@@ -2878,6 +3124,40 @@
     </w:p>
     <w:p>
       <w:pPr>
+        <w:pStyle w:val="FirstParagraph"/>
+      </w:pPr>
+      <w:r>
+        <w:rPr>
+          <w:bCs/>
+          <w:b/>
+        </w:rPr>
+        <w:t xml:space="preserve">Research frontier.</w:t>
+      </w:r>
+      <w:r>
+        <w:t xml:space="preserve"> </w:t>
+      </w:r>
+      <w:r>
+        <w:t xml:space="preserve">The</w:t>
+      </w:r>
+      <w:r>
+        <w:t xml:space="preserve"> </w:t>
+      </w:r>
+      <w:r>
+        <w:rPr>
+          <w:iCs/>
+          <w:i/>
+        </w:rPr>
+        <w:t xml:space="preserve">agent structure problem</w:t>
+      </w:r>
+      <w:r>
+        <w:t xml:space="preserve"> </w:t>
+      </w:r>
+      <w:r>
+        <w:t xml:space="preserve">(whether strong optimization provably entails an internal world model), embedded variants of AIXI, and resource-theoretic accounts of instrumental convergence.</w:t>
+      </w:r>
+    </w:p>
+    <w:p>
+      <w:pPr>
         <w:pStyle w:val="BodyText"/>
       </w:pPr>
       <w:r>
@@ -2885,7 +3165,7 @@
           <w:bCs/>
           <w:b/>
         </w:rPr>
-        <w:t xml:space="preserve">Research frontier.</w:t>
+        <w:t xml:space="preserve">Engage.</w:t>
       </w:r>
       <w:r>
         <w:t xml:space="preserve"> </w:t>
@@ -2896,23 +3176,58 @@
       <w:r>
         <w:t xml:space="preserve"> </w:t>
       </w:r>
-      <w:r>
-        <w:rPr>
-          <w:iCs/>
-          <w:i/>
-        </w:rPr>
-        <w:t xml:space="preserve">agent structure problem</w:t>
-      </w:r>
-      <w:r>
-        <w:t xml:space="preserve"> </w:t>
-      </w:r>
-      <w:r>
-        <w:t xml:space="preserve">(whether strong optimization provably entails an internal world model), embedded variants of AIXI, and resource-theoretic accounts of instrumental convergence.</w:t>
-      </w:r>
-    </w:p>
-    <w:bookmarkEnd w:id="68"/>
-    <w:bookmarkEnd w:id="69"/>
-    <w:bookmarkStart w:id="77" w:name="teaching-guide"/>
+      <w:hyperlink r:id="rId72">
+        <w:r>
+          <w:rPr>
+            <w:rStyle w:val="Hyperlink"/>
+          </w:rPr>
+          <w:t xml:space="preserve">ILIAD conference</w:t>
+        </w:r>
+      </w:hyperlink>
+      <w:r>
+        <w:t xml:space="preserve"> </w:t>
+      </w:r>
+      <w:r>
+        <w:t xml:space="preserve">is the field’s annual gathering;</w:t>
+      </w:r>
+      <w:r>
+        <w:t xml:space="preserve"> </w:t>
+      </w:r>
+      <w:hyperlink r:id="rId73">
+        <w:r>
+          <w:rPr>
+            <w:rStyle w:val="Hyperlink"/>
+          </w:rPr>
+          <w:t xml:space="preserve">PIBBSS</w:t>
+        </w:r>
+      </w:hyperlink>
+      <w:r>
+        <w:t xml:space="preserve"> </w:t>
+      </w:r>
+      <w:r>
+        <w:t xml:space="preserve">and</w:t>
+      </w:r>
+      <w:r>
+        <w:t xml:space="preserve"> </w:t>
+      </w:r>
+      <w:hyperlink r:id="rId74">
+        <w:r>
+          <w:rPr>
+            <w:rStyle w:val="Hyperlink"/>
+          </w:rPr>
+          <w:t xml:space="preserve">MATS</w:t>
+        </w:r>
+      </w:hyperlink>
+      <w:r>
+        <w:t xml:space="preserve"> </w:t>
+      </w:r>
+      <w:r>
+        <w:t xml:space="preserve">run fellowships with agent-foundations mentors; the Alignment Forum hosts the ongoing agent-foundations discussion that most of the readings above come from.</w:t>
+      </w:r>
+    </w:p>
+    <w:bookmarkEnd w:id="75"/>
+    <w:bookmarkEnd w:id="76"/>
+    <w:bookmarkStart w:id="86" w:name="teaching-guide"/>
     <w:p>
       <w:pPr>
         <w:pStyle w:val="Heading1"/>
@@ -2926,10 +3241,25 @@
         <w:pStyle w:val="FirstParagraph"/>
       </w:pPr>
       <w:r>
-        <w:t xml:space="preserve">The day mixes a single framing lecture with self-directed reading, structured discussion, and exercises. Students should already have read their one chosen pre-reading track.</w:t>
-      </w:r>
-    </w:p>
-    <w:bookmarkStart w:id="70" w:name="time-schedule"/>
+        <w:t xml:space="preserve">The day mixes a single framing lecture with self-directed reading, structured discussion, and exercises. Students should already have read their one chosen pre-reading track (see</w:t>
+      </w:r>
+      <w:r>
+        <w:t xml:space="preserve"> </w:t>
+      </w:r>
+      <w:r>
+        <w:t xml:space="preserve">“</w:t>
+      </w:r>
+      <w:r>
+        <w:t xml:space="preserve">Before the day</w:t>
+      </w:r>
+      <w:r>
+        <w:t xml:space="preserve">”</w:t>
+      </w:r>
+      <w:r>
+        <w:t xml:space="preserve">).</w:t>
+      </w:r>
+    </w:p>
+    <w:bookmarkStart w:id="77" w:name="time-schedule"/>
     <w:p>
       <w:pPr>
         <w:pStyle w:val="Heading2"/>
@@ -2942,7 +3272,37 @@
       <w:pPr>
         <w:numPr>
           <w:ilvl w:val="0"/>
-          <w:numId w:val="1009"/>
+          <w:numId w:val="1013"/>
+        </w:numPr>
+        <w:pStyle w:val="Compact"/>
+      </w:pPr>
+      <w:r>
+        <w:t xml:space="preserve">Before the day: each student signs up for one pre-reading track and reads it (see</w:t>
+      </w:r>
+      <w:r>
+        <w:t xml:space="preserve"> </w:t>
+      </w:r>
+      <w:r>
+        <w:t xml:space="preserve">“</w:t>
+      </w:r>
+      <w:r>
+        <w:t xml:space="preserve">Before the day</w:t>
+      </w:r>
+      <w:r>
+        <w:t xml:space="preserve">”</w:t>
+      </w:r>
+      <w:r>
+        <w:t xml:space="preserve"> </w:t>
+      </w:r>
+      <w:r>
+        <w:t xml:space="preserve">below).</w:t>
+      </w:r>
+    </w:p>
+    <w:p>
+      <w:pPr>
+        <w:numPr>
+          <w:ilvl w:val="0"/>
+          <w:numId w:val="1013"/>
         </w:numPr>
         <w:pStyle w:val="Compact"/>
       </w:pPr>
@@ -2954,7 +3314,7 @@
       <w:pPr>
         <w:numPr>
           <w:ilvl w:val="0"/>
-          <w:numId w:val="1009"/>
+          <w:numId w:val="1013"/>
         </w:numPr>
         <w:pStyle w:val="Compact"/>
       </w:pPr>
@@ -2966,7 +3326,7 @@
       <w:pPr>
         <w:numPr>
           <w:ilvl w:val="0"/>
-          <w:numId w:val="1009"/>
+          <w:numId w:val="1013"/>
         </w:numPr>
         <w:pStyle w:val="Compact"/>
       </w:pPr>
@@ -2978,7 +3338,7 @@
       <w:pPr>
         <w:numPr>
           <w:ilvl w:val="0"/>
-          <w:numId w:val="1009"/>
+          <w:numId w:val="1013"/>
         </w:numPr>
         <w:pStyle w:val="Compact"/>
       </w:pPr>
@@ -2990,7 +3350,7 @@
       <w:pPr>
         <w:numPr>
           <w:ilvl w:val="0"/>
-          <w:numId w:val="1009"/>
+          <w:numId w:val="1013"/>
         </w:numPr>
         <w:pStyle w:val="Compact"/>
       </w:pPr>
@@ -3002,7 +3362,7 @@
       <w:pPr>
         <w:numPr>
           <w:ilvl w:val="0"/>
-          <w:numId w:val="1009"/>
+          <w:numId w:val="1013"/>
         </w:numPr>
         <w:pStyle w:val="Compact"/>
       </w:pPr>
@@ -3014,7 +3374,7 @@
       <w:pPr>
         <w:numPr>
           <w:ilvl w:val="0"/>
-          <w:numId w:val="1009"/>
+          <w:numId w:val="1013"/>
         </w:numPr>
         <w:pStyle w:val="Compact"/>
       </w:pPr>
@@ -3027,11 +3387,11 @@
         <w:pStyle w:val="FirstParagraph"/>
       </w:pPr>
       <w:r>
-        <w:t xml:space="preserve">(Reading plus discussion totals 3.5 hours; lecture 1 hour; exercises 2 hours. Adjust the reading/discussion split toward discussion if the room is engaged.)</w:t>
-      </w:r>
-    </w:p>
-    <w:bookmarkEnd w:id="70"/>
-    <w:bookmarkStart w:id="71" w:name="required-materials"/>
+        <w:t xml:space="preserve">(Reading plus discussion totals 3.5 hours; lecture 1 hour; exercises 2 hours. Adjust the reading/discussion split toward discussion if the room is engaged. Taught once as scheduled: the lecture ran long and the discussion prompts proved too ambitious; read Notes for future iterations before re-planning.)</w:t>
+      </w:r>
+    </w:p>
+    <w:bookmarkEnd w:id="77"/>
+    <w:bookmarkStart w:id="79" w:name="required-materials"/>
     <w:p>
       <w:pPr>
         <w:pStyle w:val="Heading2"/>
@@ -3044,7 +3404,7 @@
       <w:pPr>
         <w:numPr>
           <w:ilvl w:val="0"/>
-          <w:numId w:val="1010"/>
+          <w:numId w:val="1014"/>
         </w:numPr>
         <w:pStyle w:val="Compact"/>
       </w:pPr>
@@ -3056,19 +3416,44 @@
       <w:pPr>
         <w:numPr>
           <w:ilvl w:val="0"/>
-          <w:numId w:val="1010"/>
-        </w:numPr>
-        <w:pStyle w:val="Compact"/>
-      </w:pPr>
-      <w:r>
-        <w:t xml:space="preserve">Printed (or linked) fundamental readings and the five pre-reading track sheets.</w:t>
-      </w:r>
-    </w:p>
-    <w:p>
-      <w:pPr>
-        <w:numPr>
-          <w:ilvl w:val="0"/>
-          <w:numId w:val="1010"/>
+          <w:numId w:val="1014"/>
+        </w:numPr>
+        <w:pStyle w:val="Compact"/>
+      </w:pPr>
+      <w:r>
+        <w:t xml:space="preserve">Printed (or linked) fundamental readings and the five pre-reading track sheets (</w:t>
+      </w:r>
+      <w:hyperlink r:id="rId78">
+        <w:r>
+          <w:rPr>
+            <w:rStyle w:val="Hyperlink"/>
+          </w:rPr>
+          <w:t xml:space="preserve">pre-reading instructions</w:t>
+        </w:r>
+      </w:hyperlink>
+      <w:r>
+        <w:t xml:space="preserve">;</w:t>
+      </w:r>
+      <w:r>
+        <w:t xml:space="preserve"> </w:t>
+      </w:r>
+      <w:hyperlink r:id="rId36">
+        <w:r>
+          <w:rPr>
+            <w:rStyle w:val="Hyperlink"/>
+          </w:rPr>
+          <w:t xml:space="preserve">live sign-up sheet</w:t>
+        </w:r>
+      </w:hyperlink>
+      <w:r>
+        <w:t xml:space="preserve">).</w:t>
+      </w:r>
+    </w:p>
+    <w:p>
+      <w:pPr>
+        <w:numPr>
+          <w:ilvl w:val="0"/>
+          <w:numId w:val="1014"/>
         </w:numPr>
         <w:pStyle w:val="Compact"/>
       </w:pPr>
@@ -3078,7 +3463,7 @@
       <w:r>
         <w:t xml:space="preserve"> </w:t>
       </w:r>
-      <w:hyperlink r:id="rId24">
+      <w:hyperlink r:id="rId26">
         <w:r>
           <w:rPr>
             <w:rStyle w:val="Hyperlink"/>
@@ -3095,7 +3480,7 @@
       <w:r>
         <w:t xml:space="preserve"> </w:t>
       </w:r>
-      <w:hyperlink r:id="rId25">
+      <w:hyperlink r:id="rId27">
         <w:r>
           <w:rPr>
             <w:rStyle w:val="Hyperlink"/>
@@ -3114,7 +3499,7 @@
       <w:pPr>
         <w:numPr>
           <w:ilvl w:val="0"/>
-          <w:numId w:val="1010"/>
+          <w:numId w:val="1014"/>
         </w:numPr>
         <w:pStyle w:val="Compact"/>
       </w:pPr>
@@ -3126,7 +3511,7 @@
       <w:pPr>
         <w:numPr>
           <w:ilvl w:val="0"/>
-          <w:numId w:val="1010"/>
+          <w:numId w:val="1014"/>
         </w:numPr>
         <w:pStyle w:val="Compact"/>
       </w:pPr>
@@ -3138,21 +3523,114 @@
       <w:pPr>
         <w:numPr>
           <w:ilvl w:val="0"/>
-          <w:numId w:val="1010"/>
-        </w:numPr>
-        <w:pStyle w:val="Compact"/>
-      </w:pPr>
-      <w:r>
-        <w:t xml:space="preserve">The four prerequisite refresher notes, shared with students a few days ahead.</w:t>
-      </w:r>
-    </w:p>
-    <w:bookmarkEnd w:id="71"/>
-    <w:bookmarkStart w:id="72" w:name="morning-lecture-1"/>
+          <w:numId w:val="1014"/>
+        </w:numPr>
+        <w:pStyle w:val="Compact"/>
+      </w:pPr>
+      <w:r>
+        <w:t xml:space="preserve">The four prerequisite refresher notes (linked from the</w:t>
+      </w:r>
+      <w:r>
+        <w:t xml:space="preserve"> </w:t>
+      </w:r>
+      <w:hyperlink r:id="rId22">
+        <w:r>
+          <w:rPr>
+            <w:rStyle w:val="Hyperlink"/>
+          </w:rPr>
+          <w:t xml:space="preserve">session page</w:t>
+        </w:r>
+      </w:hyperlink>
+      <w:r>
+        <w:t xml:space="preserve">), shared with students a few days ahead.</w:t>
+      </w:r>
+    </w:p>
+    <w:bookmarkEnd w:id="79"/>
+    <w:bookmarkStart w:id="80" w:name="before-the-day"/>
     <w:p>
       <w:pPr>
         <w:pStyle w:val="Heading2"/>
       </w:pPr>
       <w:r>
+        <w:t xml:space="preserve">Before the day</w:t>
+      </w:r>
+    </w:p>
+    <w:p>
+      <w:pPr>
+        <w:pStyle w:val="FirstParagraph"/>
+      </w:pPr>
+      <w:r>
+        <w:t xml:space="preserve">About a week ahead, send students the</w:t>
+      </w:r>
+      <w:r>
+        <w:t xml:space="preserve"> </w:t>
+      </w:r>
+      <w:hyperlink r:id="rId36">
+        <w:r>
+          <w:rPr>
+            <w:rStyle w:val="Hyperlink"/>
+          </w:rPr>
+          <w:t xml:space="preserve">pre-reading sign-up sheet</w:t>
+        </w:r>
+      </w:hyperlink>
+      <w:r>
+        <w:t xml:space="preserve"> </w:t>
+      </w:r>
+      <w:r>
+        <w:t xml:space="preserve">(its five topic sections are the five track sheets; a repo copy of the instructions is</w:t>
+      </w:r>
+      <w:r>
+        <w:t xml:space="preserve"> </w:t>
+      </w:r>
+      <w:hyperlink r:id="rId78">
+        <w:r>
+          <w:rPr>
+            <w:rStyle w:val="Hyperlink"/>
+          </w:rPr>
+          <w:t xml:space="preserve">here</w:t>
+        </w:r>
+      </w:hyperlink>
+      <w:r>
+        <w:t xml:space="preserve">, though the repo copy predates the optimization-and-thermodynamics note, so make sure the live sheet’s optimization track lists the note first). Each student signs up for exactly one track; the per-track slot caps keep the room balanced so every discussion group can contain one student per track. Also share the four prerequisite refresher notes (via the</w:t>
+      </w:r>
+      <w:r>
+        <w:t xml:space="preserve"> </w:t>
+      </w:r>
+      <w:hyperlink r:id="rId22">
+        <w:r>
+          <w:rPr>
+            <w:rStyle w:val="Hyperlink"/>
+          </w:rPr>
+          <w:t xml:space="preserve">session page</w:t>
+        </w:r>
+      </w:hyperlink>
+      <w:r>
+        <w:t xml:space="preserve">) and tell students to read the one matching their weakest area.</w:t>
+      </w:r>
+      <w:r>
+        <w:t xml:space="preserve"> </w:t>
+      </w:r>
+      <w:r>
+        <w:rPr>
+          <w:bCs/>
+          <w:b/>
+        </w:rPr>
+        <w:t xml:space="preserve">TN:</w:t>
+      </w:r>
+      <w:r>
+        <w:t xml:space="preserve"> </w:t>
+      </w:r>
+      <w:r>
+        <w:t xml:space="preserve">a student who arrives unprepared can still follow the day: put them in a group with a strong reader of some track and point them at the fundamental readings; the strand summaries in this document are self-contained enough for catch-up.</w:t>
+      </w:r>
+    </w:p>
+    <w:bookmarkEnd w:id="80"/>
+    <w:bookmarkStart w:id="81" w:name="morning-lecture-1"/>
+    <w:p>
+      <w:pPr>
+        <w:pStyle w:val="Heading2"/>
+      </w:pPr>
+      <w:r>
         <w:t xml:space="preserve">Morning lecture</w:t>
       </w:r>
     </w:p>
@@ -3166,7 +3644,7 @@
       <w:r>
         <w:t xml:space="preserve"> </w:t>
       </w:r>
-      <w:hyperlink r:id="rId23">
+      <w:hyperlink r:id="rId24">
         <w:r>
           <w:rPr>
             <w:rStyle w:val="Hyperlink"/>
@@ -3226,6 +3704,42 @@
       </w:r>
       <w:r>
         <w:t xml:space="preserve">the previews only need to plant the question each strand answers; depth comes from the students’ own pre-reading and the discussion, so do not over-explain any one strand here. Leave 10 minutes for questions.</w:t>
+      </w:r>
+    </w:p>
+    <w:p>
+      <w:pPr>
+        <w:pStyle w:val="BodyText"/>
+      </w:pPr>
+      <w:r>
+        <w:rPr>
+          <w:bCs/>
+          <w:b/>
+        </w:rPr>
+        <w:t xml:space="preserve">TN (post-teaching):</w:t>
+      </w:r>
+      <w:r>
+        <w:t xml:space="preserve"> </w:t>
+      </w:r>
+      <w:r>
+        <w:t xml:space="preserve">the deck ran long and dense when taught. If trimming, keep every strand preview and cut from within sections instead (the two</w:t>
+      </w:r>
+      <w:r>
+        <w:t xml:space="preserve"> </w:t>
+      </w:r>
+      <w:r>
+        <w:t xml:space="preserve">“</w:t>
+      </w:r>
+      <w:r>
+        <w:t xml:space="preserve">Logical Uncertainty: Open Problems</w:t>
+      </w:r>
+      <w:r>
+        <w:t xml:space="preserve">”</w:t>
+      </w:r>
+      <w:r>
+        <w:t xml:space="preserve"> </w:t>
+      </w:r>
+      <w:r>
+        <w:t xml:space="preserve">slides and the second coherence slide are the safest cuts), and prefer adding a worked example over adding another abstraction.</w:t>
       </w:r>
     </w:p>
     <w:p>
@@ -3578,7 +4092,7 @@
       <w:r>
         <w:t xml:space="preserve"> </w:t>
       </w:r>
-      <w:hyperlink r:id="rId41">
+      <w:hyperlink r:id="rId45">
         <w:r>
           <w:rPr>
             <w:rStyle w:val="Hyperlink"/>
@@ -3611,8 +4125,8 @@
         <w:t xml:space="preserve">slide is the two-bridge argument of Section 8 of that note, and Exercise 4 is the single-step backbone of the bound.</w:t>
       </w:r>
     </w:p>
-    <w:bookmarkEnd w:id="72"/>
-    <w:bookmarkStart w:id="73" w:name="fundamental-reading-1"/>
+    <w:bookmarkEnd w:id="81"/>
+    <w:bookmarkStart w:id="82" w:name="fundamental-reading-1"/>
     <w:p>
       <w:pPr>
         <w:pStyle w:val="Heading2"/>
@@ -3655,11 +4169,11 @@
         <w:t xml:space="preserve">connections to their own track</w:t>
       </w:r>
       <w:r>
-        <w:t xml:space="preserve">, not for full coverage; the connections are the raw material for the discussion. Embedded agency is the anchor; the other three each sharpen one thread (why this approach, reflective stability, general-purpose search).</w:t>
-      </w:r>
-    </w:p>
-    <w:bookmarkEnd w:id="73"/>
-    <w:bookmarkStart w:id="74" w:name="cross-pollination-discussion-1"/>
+        <w:t xml:space="preserve">, not for full coverage; the connections are the raw material for the discussion. Embedded agency is the anchor; the other three each sharpen one theme (why this approach, reflective stability, general-purpose search).</w:t>
+      </w:r>
+    </w:p>
+    <w:bookmarkEnd w:id="82"/>
+    <w:bookmarkStart w:id="83" w:name="cross-pollination-discussion-1"/>
     <w:p>
       <w:pPr>
         <w:pStyle w:val="Heading2"/>
@@ -3689,7 +4203,23 @@
         <w:t xml:space="preserve"> </w:t>
       </w:r>
       <w:r>
-        <w:t xml:space="preserve">the failure mode is a student who read a topic answering for everyone. Run it as: each member first explains their own track’s core idea to the group in two minutes, then the group works a cross-pollination prompt together. Let each group pick the prompts that span the tracks present; float between groups and seed a stuck group with one concrete sub-question (for example,</w:t>
+        <w:t xml:space="preserve">the failure mode is a student who read a topic answering for everyone. Run it as: each member first teaches their track’s core idea to the group, with clarifying questions (give this a generous share of the block; when taught, this cross-exposure was the most valuable part); then, if the group has energy left, they work a cross-pollination prompt together.</w:t>
+      </w:r>
+      <w:r>
+        <w:t xml:space="preserve"> </w:t>
+      </w:r>
+      <w:r>
+        <w:rPr>
+          <w:bCs/>
+          <w:b/>
+        </w:rPr>
+        <w:t xml:space="preserve">TN (post-teaching):</w:t>
+      </w:r>
+      <w:r>
+        <w:t xml:space="preserve"> </w:t>
+      </w:r>
+      <w:r>
+        <w:t xml:space="preserve">the prompts below proved too ambitious for students one day into the material; treat them as extensions for strong groups, not the core activity. Let each group pick the prompts that span the tracks present; float between groups and seed a stuck group with one concrete sub-question (for example,</w:t>
       </w:r>
       <w:r>
         <w:t xml:space="preserve"> </w:t>
@@ -3719,7 +4249,7 @@
       <w:pPr>
         <w:numPr>
           <w:ilvl w:val="0"/>
-          <w:numId w:val="1011"/>
+          <w:numId w:val="1015"/>
         </w:numPr>
         <w:pStyle w:val="Compact"/>
       </w:pPr>
@@ -3741,7 +4271,7 @@
       <w:pPr>
         <w:numPr>
           <w:ilvl w:val="0"/>
-          <w:numId w:val="1011"/>
+          <w:numId w:val="1015"/>
         </w:numPr>
         <w:pStyle w:val="Compact"/>
       </w:pPr>
@@ -3778,7 +4308,7 @@
       <w:pPr>
         <w:numPr>
           <w:ilvl w:val="0"/>
-          <w:numId w:val="1011"/>
+          <w:numId w:val="1015"/>
         </w:numPr>
         <w:pStyle w:val="Compact"/>
       </w:pPr>
@@ -3793,14 +4323,32 @@
         <w:t xml:space="preserve"> </w:t>
       </w:r>
       <w:r>
-        <w:t xml:space="preserve">The Dutch-book argument behind coherence presupposes logical omniscience (computing expected utilities needs the logical consequences of one’s beliefs). How does logical uncertainty interact with the foundations of coherence?</w:t>
-      </w:r>
-    </w:p>
-    <w:p>
-      <w:pPr>
-        <w:numPr>
-          <w:ilvl w:val="0"/>
-          <w:numId w:val="1011"/>
+        <w:t xml:space="preserve">The Dutch-book argument behind coherence presupposes logical omniscience (computing expected utilities needs the logical consequences of one’s beliefs), and the logical-induction criterion is exactly the</w:t>
+      </w:r>
+      <w:r>
+        <w:t xml:space="preserve"> </w:t>
+      </w:r>
+      <w:r>
+        <w:t xml:space="preserve">“</w:t>
+      </w:r>
+      <w:r>
+        <w:t xml:space="preserve">no efficient Dutch book</w:t>
+      </w:r>
+      <w:r>
+        <w:t xml:space="preserve">”</w:t>
+      </w:r>
+      <w:r>
+        <w:t xml:space="preserve"> </w:t>
+      </w:r>
+      <w:r>
+        <w:t xml:space="preserve">analogue. How does logical uncertainty reshape coherence arguments?</w:t>
+      </w:r>
+    </w:p>
+    <w:p>
+      <w:pPr>
+        <w:numPr>
+          <w:ilvl w:val="0"/>
+          <w:numId w:val="1015"/>
         </w:numPr>
         <w:pStyle w:val="Compact"/>
       </w:pPr>
@@ -3822,7 +4370,7 @@
       <w:pPr>
         <w:numPr>
           <w:ilvl w:val="0"/>
-          <w:numId w:val="1011"/>
+          <w:numId w:val="1015"/>
         </w:numPr>
         <w:pStyle w:val="Compact"/>
       </w:pPr>
@@ -3868,44 +4416,26 @@
       <w:pPr>
         <w:numPr>
           <w:ilvl w:val="0"/>
-          <w:numId w:val="1011"/>
-        </w:numPr>
-        <w:pStyle w:val="Compact"/>
-      </w:pPr>
-      <w:r>
-        <w:rPr>
-          <w:bCs/>
-          <w:b/>
-        </w:rPr>
-        <w:t xml:space="preserve">Consequentialist foundations × logical induction.</w:t>
-      </w:r>
-      <w:r>
-        <w:t xml:space="preserve"> </w:t>
-      </w:r>
-      <w:r>
-        <w:t xml:space="preserve">Coherence assumes the agent can price any bet correctly; the logical-induction criterion is the</w:t>
-      </w:r>
-      <w:r>
-        <w:t xml:space="preserve"> </w:t>
-      </w:r>
-      <w:r>
-        <w:t xml:space="preserve">“</w:t>
-      </w:r>
-      <w:r>
-        <w:t xml:space="preserve">no efficient Dutch book</w:t>
-      </w:r>
-      <w:r>
-        <w:t xml:space="preserve">”</w:t>
-      </w:r>
-      <w:r>
-        <w:t xml:space="preserve"> </w:t>
-      </w:r>
-      <w:r>
-        <w:t xml:space="preserve">analogue. How does logical uncertainty reshape coherence arguments?</w:t>
-      </w:r>
-    </w:p>
-    <w:bookmarkEnd w:id="74"/>
-    <w:bookmarkStart w:id="75" w:name="exercise-session-1"/>
+          <w:numId w:val="1015"/>
+        </w:numPr>
+        <w:pStyle w:val="Compact"/>
+      </w:pPr>
+      <w:r>
+        <w:rPr>
+          <w:bCs/>
+          <w:b/>
+        </w:rPr>
+        <w:t xml:space="preserve">Löb’s theorem and tiling agents × descriptive agent foundations.</w:t>
+      </w:r>
+      <w:r>
+        <w:t xml:space="preserve"> </w:t>
+      </w:r>
+      <w:r>
+        <w:t xml:space="preserve">Tiling asks whether an agent can verify a successor; selection theorems ask what structures selection pressure produces. Would an optimization process that keeps building successors select for agents that can verify them, and what internal structure would that force?</w:t>
+      </w:r>
+    </w:p>
+    <w:bookmarkEnd w:id="83"/>
+    <w:bookmarkStart w:id="84" w:name="exercise-session-1"/>
     <w:p>
       <w:pPr>
         <w:pStyle w:val="Heading2"/>
@@ -3924,7 +4454,7 @@
       <w:r>
         <w:t xml:space="preserve"> </w:t>
       </w:r>
-      <w:hyperlink r:id="rId24">
+      <w:hyperlink r:id="rId26">
         <w:r>
           <w:rPr>
             <w:rStyle w:val="Hyperlink"/>
@@ -3954,7 +4484,7 @@
       <w:r>
         <w:t xml:space="preserve"> </w:t>
       </w:r>
-      <w:hyperlink r:id="rId25">
+      <w:hyperlink r:id="rId27">
         <w:r>
           <w:rPr>
             <w:rStyle w:val="Hyperlink"/>
@@ -4117,8 +4647,8 @@
         <w:t xml:space="preserve">): the exercise shows an optimal policy need not coordinate across a modular environment, which is the formal version of that slide’s claim.</w:t>
       </w:r>
     </w:p>
-    <w:bookmarkEnd w:id="75"/>
-    <w:bookmarkStart w:id="76" w:name="daily-checkpoint-1"/>
+    <w:bookmarkEnd w:id="84"/>
+    <w:bookmarkStart w:id="85" w:name="daily-checkpoint-1"/>
     <w:p>
       <w:pPr>
         <w:pStyle w:val="Heading2"/>
@@ -4132,12 +4662,20 @@
         <w:pStyle w:val="FirstParagraph"/>
       </w:pPr>
       <w:r>
-        <w:t xml:space="preserve">Run the six-question checkpoint (above) as a quick individual quiz, then read out the answers. It doubles as an attendance check and tees up the feedback form.</w:t>
-      </w:r>
-    </w:p>
-    <w:bookmarkEnd w:id="76"/>
-    <w:bookmarkEnd w:id="77"/>
-    <w:bookmarkStart w:id="78" w:name="notes-for-future-iterations"/>
+        <w:t xml:space="preserve">Run the live Jotform checkpoint (13 questions); the seven questions in Main content are the self-contained core to use if the form is unavailable. Read out the answers afterward; the quiz doubles as an attendance check and tees up the feedback form.</w:t>
+      </w:r>
+    </w:p>
+    <w:p>
+      <w:pPr>
+        <w:pStyle w:val="BodyText"/>
+      </w:pPr>
+      <w:r>
+        <w:t xml:space="preserve">Answer key for the in-document questions: 1(b), 2(c), 3(a), 4(d), 5(b), 6(a), 7(c).</w:t>
+      </w:r>
+    </w:p>
+    <w:bookmarkEnd w:id="85"/>
+    <w:bookmarkEnd w:id="86"/>
+    <w:bookmarkStart w:id="87" w:name="notes-for-future-iterations"/>
     <w:p>
       <w:pPr>
         <w:pStyle w:val="Heading1"/>
@@ -4150,7 +4688,7 @@
       <w:pPr>
         <w:numPr>
           <w:ilvl w:val="0"/>
-          <w:numId w:val="1012"/>
+          <w:numId w:val="1016"/>
         </w:numPr>
         <w:pStyle w:val="Compact"/>
       </w:pPr>
@@ -4162,7 +4700,7 @@
       <w:pPr>
         <w:numPr>
           <w:ilvl w:val="1"/>
-          <w:numId w:val="1013"/>
+          <w:numId w:val="1017"/>
         </w:numPr>
         <w:pStyle w:val="Compact"/>
       </w:pPr>
@@ -4174,7 +4712,7 @@
       <w:pPr>
         <w:numPr>
           <w:ilvl w:val="1"/>
-          <w:numId w:val="1013"/>
+          <w:numId w:val="1017"/>
         </w:numPr>
         <w:pStyle w:val="Compact"/>
       </w:pPr>
@@ -4186,7 +4724,7 @@
       <w:pPr>
         <w:numPr>
           <w:ilvl w:val="1"/>
-          <w:numId w:val="1013"/>
+          <w:numId w:val="1017"/>
         </w:numPr>
         <w:pStyle w:val="Compact"/>
       </w:pPr>
@@ -4198,7 +4736,7 @@
       <w:pPr>
         <w:numPr>
           <w:ilvl w:val="1"/>
-          <w:numId w:val="1013"/>
+          <w:numId w:val="1017"/>
         </w:numPr>
         <w:pStyle w:val="Compact"/>
       </w:pPr>
@@ -4210,7 +4748,7 @@
       <w:pPr>
         <w:numPr>
           <w:ilvl w:val="0"/>
-          <w:numId w:val="1012"/>
+          <w:numId w:val="1016"/>
         </w:numPr>
         <w:pStyle w:val="Compact"/>
       </w:pPr>
@@ -4222,7 +4760,7 @@
       <w:pPr>
         <w:numPr>
           <w:ilvl w:val="1"/>
-          <w:numId w:val="1014"/>
+          <w:numId w:val="1018"/>
         </w:numPr>
         <w:pStyle w:val="Compact"/>
       </w:pPr>
@@ -4234,7 +4772,7 @@
       <w:pPr>
         <w:numPr>
           <w:ilvl w:val="1"/>
-          <w:numId w:val="1014"/>
+          <w:numId w:val="1018"/>
         </w:numPr>
         <w:pStyle w:val="Compact"/>
       </w:pPr>
@@ -4246,7 +4784,7 @@
       <w:pPr>
         <w:numPr>
           <w:ilvl w:val="1"/>
-          <w:numId w:val="1014"/>
+          <w:numId w:val="1018"/>
         </w:numPr>
         <w:pStyle w:val="Compact"/>
       </w:pPr>
@@ -4258,7 +4796,7 @@
       <w:pPr>
         <w:numPr>
           <w:ilvl w:val="0"/>
-          <w:numId w:val="1012"/>
+          <w:numId w:val="1016"/>
         </w:numPr>
         <w:pStyle w:val="Compact"/>
       </w:pPr>
@@ -4270,7 +4808,7 @@
       <w:pPr>
         <w:numPr>
           <w:ilvl w:val="1"/>
-          <w:numId w:val="1015"/>
+          <w:numId w:val="1019"/>
         </w:numPr>
         <w:pStyle w:val="Compact"/>
       </w:pPr>
@@ -4282,7 +4820,7 @@
       <w:pPr>
         <w:numPr>
           <w:ilvl w:val="1"/>
-          <w:numId w:val="1015"/>
+          <w:numId w:val="1019"/>
         </w:numPr>
         <w:pStyle w:val="Compact"/>
       </w:pPr>
@@ -4294,7 +4832,7 @@
       <w:pPr>
         <w:numPr>
           <w:ilvl w:val="1"/>
-          <w:numId w:val="1015"/>
+          <w:numId w:val="1019"/>
         </w:numPr>
         <w:pStyle w:val="Compact"/>
       </w:pPr>
@@ -4306,7 +4844,7 @@
       <w:pPr>
         <w:numPr>
           <w:ilvl w:val="0"/>
-          <w:numId w:val="1012"/>
+          <w:numId w:val="1016"/>
         </w:numPr>
         <w:pStyle w:val="Compact"/>
       </w:pPr>
@@ -4318,7 +4856,7 @@
       <w:pPr>
         <w:numPr>
           <w:ilvl w:val="0"/>
-          <w:numId w:val="1012"/>
+          <w:numId w:val="1016"/>
         </w:numPr>
         <w:pStyle w:val="Compact"/>
       </w:pPr>
@@ -4330,7 +4868,7 @@
       <w:pPr>
         <w:numPr>
           <w:ilvl w:val="1"/>
-          <w:numId w:val="1016"/>
+          <w:numId w:val="1020"/>
         </w:numPr>
         <w:pStyle w:val="Compact"/>
       </w:pPr>
@@ -4342,7 +4880,7 @@
       <w:pPr>
         <w:numPr>
           <w:ilvl w:val="1"/>
-          <w:numId w:val="1016"/>
+          <w:numId w:val="1020"/>
         </w:numPr>
         <w:pStyle w:val="Compact"/>
       </w:pPr>
@@ -4354,7 +4892,7 @@
       <w:pPr>
         <w:numPr>
           <w:ilvl w:val="1"/>
-          <w:numId w:val="1016"/>
+          <w:numId w:val="1020"/>
         </w:numPr>
         <w:pStyle w:val="Compact"/>
       </w:pPr>
@@ -4366,7 +4904,7 @@
       <w:pPr>
         <w:numPr>
           <w:ilvl w:val="1"/>
-          <w:numId w:val="1016"/>
+          <w:numId w:val="1020"/>
         </w:numPr>
         <w:pStyle w:val="Compact"/>
       </w:pPr>
@@ -4378,7 +4916,7 @@
       <w:pPr>
         <w:numPr>
           <w:ilvl w:val="1"/>
-          <w:numId w:val="1016"/>
+          <w:numId w:val="1020"/>
         </w:numPr>
         <w:pStyle w:val="Compact"/>
       </w:pPr>
@@ -4386,7 +4924,7 @@
         <w:t xml:space="preserve">Alignment needs to be solved on a first critical try</w:t>
       </w:r>
     </w:p>
-    <w:bookmarkEnd w:id="78"/>
+    <w:bookmarkEnd w:id="87"/>
     <w:sectPr/>
   </w:body>
 </w:document>
@@ -4679,6 +5217,9 @@
     <w:abstractNumId w:val="991"/>
   </w:num>
   <w:num w:numId="1008">
+    <w:abstractNumId w:val="991"/>
+  </w:num>
+  <w:num w:numId="1009">
     <w:abstractNumId w:val="99411"/>
     <w:lvlOverride w:ilvl="0">
       <w:startOverride w:val="1"/>
@@ -4708,13 +5249,22 @@
       <w:startOverride w:val="1"/>
     </w:lvlOverride>
   </w:num>
-  <w:num w:numId="1009">
-    <w:abstractNumId w:val="991"/>
-  </w:num>
   <w:num w:numId="1010">
     <w:abstractNumId w:val="991"/>
   </w:num>
   <w:num w:numId="1011">
+    <w:abstractNumId w:val="991"/>
+  </w:num>
+  <w:num w:numId="1012">
+    <w:abstractNumId w:val="991"/>
+  </w:num>
+  <w:num w:numId="1013">
+    <w:abstractNumId w:val="991"/>
+  </w:num>
+  <w:num w:numId="1014">
+    <w:abstractNumId w:val="991"/>
+  </w:num>
+  <w:num w:numId="1015">
     <w:abstractNumId w:val="99411"/>
     <w:lvlOverride w:ilvl="0">
       <w:startOverride w:val="1"/>
@@ -4744,19 +5294,19 @@
       <w:startOverride w:val="1"/>
     </w:lvlOverride>
   </w:num>
-  <w:num w:numId="1012">
+  <w:num w:numId="1016">
     <w:abstractNumId w:val="991"/>
   </w:num>
-  <w:num w:numId="1013">
+  <w:num w:numId="1017">
     <w:abstractNumId w:val="991"/>
   </w:num>
-  <w:num w:numId="1014">
+  <w:num w:numId="1018">
     <w:abstractNumId w:val="991"/>
   </w:num>
-  <w:num w:numId="1015">
+  <w:num w:numId="1019">
     <w:abstractNumId w:val="991"/>
   </w:num>
-  <w:num w:numId="1016">
+  <w:num w:numId="1020">
     <w:abstractNumId w:val="991"/>
   </w:num>
 </w:numbering>

</xml_diff>